<commit_message>
update oral week 4-6 and new deliverables
</commit_message>
<xml_diff>
--- a/week5/Week5-report.docx
+++ b/week5/Week5-report.docx
@@ -47,18 +47,7 @@
           <w:sz w:val="24"/>
           <w:szCs w:val="24"/>
         </w:rPr>
-        <w:t xml:space="preserve">HO CHI MINH </w:t>
-      </w:r>
-      <w:r>
-        <w:rPr>
-          <w:rFonts w:ascii="Times New Roman" w:hAnsi="Times New Roman" w:cs="Times New Roman"/>
-          <w:b/>
-          <w:bCs/>
-          <w:color w:val="000000"/>
-          <w:sz w:val="24"/>
-          <w:szCs w:val="24"/>
-        </w:rPr>
-        <w:t>CAMPUS</w:t>
+        <w:t>HO CHI MINH CAMPUS</w:t>
       </w:r>
     </w:p>
     <w:p>
@@ -76,9 +65,11 @@
       <w:r>
         <w:rPr>
           <w:noProof/>
+          <w:sz w:val="24"/>
+          <w:szCs w:val="24"/>
         </w:rPr>
         <w:drawing>
-          <wp:anchor distT="0" distB="0" distL="114300" distR="114300" simplePos="0" relativeHeight="251659264" behindDoc="1" locked="0" layoutInCell="1" allowOverlap="1" wp14:anchorId="09EB59F3" wp14:editId="38643964">
+          <wp:anchor distT="0" distB="0" distL="114300" distR="114300" simplePos="0" relativeHeight="251659264" behindDoc="1" locked="0" layoutInCell="1" allowOverlap="1" wp14:anchorId="09EB59F3" wp14:editId="1FA91EC9">
             <wp:simplePos x="0" y="0"/>
             <wp:positionH relativeFrom="margin">
               <wp:align>left</wp:align>
@@ -258,8 +249,8 @@
           <w:bCs/>
           <w:color w:val="000000"/>
           <w:kern w:val="0"/>
-          <w:sz w:val="36"/>
-          <w:szCs w:val="36"/>
+          <w:sz w:val="24"/>
+          <w:szCs w:val="24"/>
           <w:lang w:val="vi-VN"/>
           <w14:ligatures w14:val="none"/>
         </w:rPr>
@@ -271,8 +262,8 @@
           <w:bCs/>
           <w:color w:val="000000"/>
           <w:kern w:val="0"/>
-          <w:sz w:val="36"/>
-          <w:szCs w:val="36"/>
+          <w:sz w:val="24"/>
+          <w:szCs w:val="24"/>
           <w14:ligatures w14:val="none"/>
         </w:rPr>
         <w:t>COS30018</w:t>
@@ -284,8 +275,8 @@
           <w:bCs/>
           <w:color w:val="000000"/>
           <w:kern w:val="0"/>
-          <w:sz w:val="36"/>
-          <w:szCs w:val="36"/>
+          <w:sz w:val="24"/>
+          <w:szCs w:val="24"/>
           <w:lang w:val="vi-VN"/>
           <w14:ligatures w14:val="none"/>
         </w:rPr>
@@ -298,8 +289,8 @@
           <w:bCs/>
           <w:color w:val="000000"/>
           <w:kern w:val="0"/>
-          <w:sz w:val="36"/>
-          <w:szCs w:val="36"/>
+          <w:sz w:val="24"/>
+          <w:szCs w:val="24"/>
           <w14:ligatures w14:val="none"/>
         </w:rPr>
         <w:t>-</w:t>
@@ -311,8 +302,8 @@
           <w:bCs/>
           <w:color w:val="000000"/>
           <w:kern w:val="0"/>
-          <w:sz w:val="36"/>
-          <w:szCs w:val="36"/>
+          <w:sz w:val="24"/>
+          <w:szCs w:val="24"/>
           <w:lang w:val="vi-VN"/>
           <w14:ligatures w14:val="none"/>
         </w:rPr>
@@ -325,8 +316,8 @@
           <w:bCs/>
           <w:color w:val="000000"/>
           <w:kern w:val="0"/>
-          <w:sz w:val="36"/>
-          <w:szCs w:val="36"/>
+          <w:sz w:val="24"/>
+          <w:szCs w:val="24"/>
           <w14:ligatures w14:val="none"/>
         </w:rPr>
         <w:t>COS30018-Intelligent Systems</w:t>
@@ -341,8 +332,9 @@
           <w:bCs/>
           <w:color w:val="000000"/>
           <w:kern w:val="0"/>
-          <w:sz w:val="36"/>
-          <w:szCs w:val="36"/>
+          <w:sz w:val="24"/>
+          <w:szCs w:val="24"/>
+          <w:lang w:val="vi-VN"/>
           <w14:ligatures w14:val="none"/>
         </w:rPr>
       </w:pPr>
@@ -353,8 +345,8 @@
           <w:bCs/>
           <w:color w:val="000000"/>
           <w:kern w:val="0"/>
-          <w:sz w:val="36"/>
-          <w:szCs w:val="36"/>
+          <w:sz w:val="24"/>
+          <w:szCs w:val="24"/>
           <w14:ligatures w14:val="none"/>
         </w:rPr>
         <w:t>Week</w:t>
@@ -366,8 +358,8 @@
           <w:bCs/>
           <w:color w:val="000000"/>
           <w:kern w:val="0"/>
-          <w:sz w:val="36"/>
-          <w:szCs w:val="36"/>
+          <w:sz w:val="24"/>
+          <w:szCs w:val="24"/>
           <w14:ligatures w14:val="none"/>
         </w:rPr>
         <w:t xml:space="preserve"> 5</w:t>
@@ -379,8 +371,8 @@
           <w:bCs/>
           <w:color w:val="000000"/>
           <w:kern w:val="0"/>
-          <w:sz w:val="36"/>
-          <w:szCs w:val="36"/>
+          <w:sz w:val="24"/>
+          <w:szCs w:val="24"/>
           <w14:ligatures w14:val="none"/>
         </w:rPr>
         <w:t xml:space="preserve">: </w:t>
@@ -392,11 +384,11 @@
           <w:bCs/>
           <w:color w:val="000000"/>
           <w:kern w:val="0"/>
-          <w:sz w:val="36"/>
-          <w:szCs w:val="36"/>
+          <w:sz w:val="24"/>
+          <w:szCs w:val="24"/>
           <w14:ligatures w14:val="none"/>
         </w:rPr>
-        <w:t>Report</w:t>
+        <w:t>Task C.2</w:t>
       </w:r>
     </w:p>
     <w:p>
@@ -408,8 +400,8 @@
           <w:bCs/>
           <w:color w:val="000000"/>
           <w:kern w:val="0"/>
-          <w:sz w:val="36"/>
-          <w:szCs w:val="36"/>
+          <w:sz w:val="24"/>
+          <w:szCs w:val="24"/>
           <w14:ligatures w14:val="none"/>
         </w:rPr>
       </w:pPr>
@@ -515,25 +507,7 @@
           <w:sz w:val="24"/>
           <w:szCs w:val="24"/>
         </w:rPr>
-        <w:t>STUDENT NAME:</w:t>
-      </w:r>
-      <w:r>
-        <w:rPr>
-          <w:rFonts w:ascii="Times New Roman" w:hAnsi="Times New Roman" w:cs="Times New Roman"/>
-          <w:b/>
-          <w:sz w:val="24"/>
-          <w:szCs w:val="24"/>
-        </w:rPr>
-        <w:t xml:space="preserve"> </w:t>
-      </w:r>
-      <w:r>
-        <w:rPr>
-          <w:rFonts w:ascii="Times New Roman" w:hAnsi="Times New Roman" w:cs="Times New Roman"/>
-          <w:b/>
-          <w:sz w:val="24"/>
-          <w:szCs w:val="24"/>
-        </w:rPr>
-        <w:t>LÊ TIẾN DŨNG-SWS00683</w:t>
+        <w:t>STUDENT NAME: LÊ TIẾN DŨNG-SWS00683</w:t>
       </w:r>
     </w:p>
     <w:p>
@@ -619,8 +593,8 @@
           <w:bCs/>
           <w:color w:val="000000"/>
           <w:kern w:val="0"/>
-          <w:sz w:val="32"/>
-          <w:szCs w:val="28"/>
+          <w:sz w:val="24"/>
+          <w:szCs w:val="24"/>
           <w14:ligatures w14:val="none"/>
         </w:rPr>
       </w:pPr>
@@ -633,8 +607,8 @@
           <w:bCs/>
           <w:color w:val="000000"/>
           <w:kern w:val="0"/>
-          <w:sz w:val="36"/>
-          <w:szCs w:val="36"/>
+          <w:sz w:val="24"/>
+          <w:szCs w:val="24"/>
           <w14:ligatures w14:val="none"/>
         </w:rPr>
       </w:pPr>
@@ -647,8 +621,8 @@
           <w:bCs/>
           <w:color w:val="000000"/>
           <w:kern w:val="0"/>
-          <w:sz w:val="36"/>
-          <w:szCs w:val="36"/>
+          <w:sz w:val="24"/>
+          <w:szCs w:val="24"/>
           <w14:ligatures w14:val="none"/>
         </w:rPr>
       </w:pPr>
@@ -661,8 +635,8 @@
           <w:bCs/>
           <w:color w:val="000000"/>
           <w:kern w:val="0"/>
-          <w:sz w:val="36"/>
-          <w:szCs w:val="36"/>
+          <w:sz w:val="24"/>
+          <w:szCs w:val="24"/>
           <w14:ligatures w14:val="none"/>
         </w:rPr>
       </w:pPr>
@@ -675,8 +649,8 @@
           <w:bCs/>
           <w:color w:val="000000"/>
           <w:kern w:val="0"/>
-          <w:sz w:val="36"/>
-          <w:szCs w:val="36"/>
+          <w:sz w:val="24"/>
+          <w:szCs w:val="24"/>
           <w14:ligatures w14:val="none"/>
         </w:rPr>
       </w:pPr>
@@ -689,8 +663,8 @@
           <w:bCs/>
           <w:color w:val="000000"/>
           <w:kern w:val="0"/>
-          <w:sz w:val="36"/>
-          <w:szCs w:val="36"/>
+          <w:sz w:val="24"/>
+          <w:szCs w:val="24"/>
           <w14:ligatures w14:val="none"/>
         </w:rPr>
       </w:pPr>
@@ -703,8 +677,8 @@
           <w:bCs/>
           <w:color w:val="000000"/>
           <w:kern w:val="0"/>
-          <w:sz w:val="36"/>
-          <w:szCs w:val="36"/>
+          <w:sz w:val="24"/>
+          <w:szCs w:val="24"/>
           <w14:ligatures w14:val="none"/>
         </w:rPr>
       </w:pPr>
@@ -717,8 +691,8 @@
           <w:bCs/>
           <w:color w:val="000000"/>
           <w:kern w:val="0"/>
-          <w:sz w:val="36"/>
-          <w:szCs w:val="36"/>
+          <w:sz w:val="24"/>
+          <w:szCs w:val="24"/>
           <w14:ligatures w14:val="none"/>
         </w:rPr>
       </w:pPr>
@@ -731,8 +705,8 @@
           <w:bCs/>
           <w:color w:val="000000"/>
           <w:kern w:val="0"/>
-          <w:sz w:val="36"/>
-          <w:szCs w:val="36"/>
+          <w:sz w:val="24"/>
+          <w:szCs w:val="24"/>
           <w14:ligatures w14:val="none"/>
         </w:rPr>
       </w:pPr>
@@ -743,8 +717,8 @@
           <w:rFonts w:asciiTheme="minorHAnsi" w:eastAsiaTheme="minorHAnsi" w:hAnsiTheme="minorHAnsi" w:cstheme="minorBidi"/>
           <w:color w:val="auto"/>
           <w:kern w:val="2"/>
-          <w:sz w:val="22"/>
-          <w:szCs w:val="22"/>
+          <w:sz w:val="24"/>
+          <w:szCs w:val="24"/>
           <w14:ligatures w14:val="standardContextual"/>
         </w:rPr>
         <w:id w:val="-1039898805"/>
@@ -764,8 +738,16 @@
         <w:p>
           <w:pPr>
             <w:pStyle w:val="TOCHeading"/>
+            <w:rPr>
+              <w:sz w:val="24"/>
+              <w:szCs w:val="24"/>
+            </w:rPr>
           </w:pPr>
           <w:r>
+            <w:rPr>
+              <w:sz w:val="24"/>
+              <w:szCs w:val="24"/>
+            </w:rPr>
             <w:t>Contents</w:t>
           </w:r>
         </w:p>
@@ -783,21 +765,33 @@
             </w:rPr>
           </w:pPr>
           <w:r>
+            <w:rPr>
+              <w:sz w:val="24"/>
+              <w:szCs w:val="24"/>
+            </w:rPr>
             <w:fldChar w:fldCharType="begin"/>
           </w:r>
           <w:r>
+            <w:rPr>
+              <w:sz w:val="24"/>
+              <w:szCs w:val="24"/>
+            </w:rPr>
             <w:instrText xml:space="preserve"> TOC \o "1-3" \h \z \u </w:instrText>
           </w:r>
           <w:r>
+            <w:rPr>
+              <w:sz w:val="24"/>
+              <w:szCs w:val="24"/>
+            </w:rPr>
             <w:fldChar w:fldCharType="separate"/>
           </w:r>
-          <w:hyperlink w:anchor="_Toc223810528" w:history="1">
+          <w:hyperlink w:anchor="_Toc225528772" w:history="1">
             <w:r>
               <w:rPr>
                 <w:rStyle w:val="Hyperlink"/>
                 <w:noProof/>
               </w:rPr>
-              <w:t>1. Beyond just the Close price, how do features like Volume or High/Low provide extra context to a Deep Learning model?</w:t>
+              <w:t>Evidence of execution (from my notebook output)</w:t>
             </w:r>
             <w:r>
               <w:rPr>
@@ -818,7 +812,7 @@
                 <w:noProof/>
                 <w:webHidden/>
               </w:rPr>
-              <w:instrText xml:space="preserve"> PAGEREF _Toc223810528 \h </w:instrText>
+              <w:instrText xml:space="preserve"> PAGEREF _Toc225528772 \h </w:instrText>
             </w:r>
             <w:r>
               <w:rPr>
@@ -862,7 +856,575 @@
               <w:szCs w:val="24"/>
             </w:rPr>
           </w:pPr>
-          <w:hyperlink w:anchor="_Toc223810529" w:history="1">
+          <w:hyperlink w:anchor="_Toc225528773" w:history="1">
+            <w:r>
+              <w:rPr>
+                <w:rStyle w:val="Hyperlink"/>
+                <w:noProof/>
+              </w:rPr>
+              <w:t>Summary of effort: explaining the less straightforward code lines</w:t>
+            </w:r>
+            <w:r>
+              <w:rPr>
+                <w:noProof/>
+                <w:webHidden/>
+              </w:rPr>
+              <w:tab/>
+            </w:r>
+            <w:r>
+              <w:rPr>
+                <w:noProof/>
+                <w:webHidden/>
+              </w:rPr>
+              <w:fldChar w:fldCharType="begin"/>
+            </w:r>
+            <w:r>
+              <w:rPr>
+                <w:noProof/>
+                <w:webHidden/>
+              </w:rPr>
+              <w:instrText xml:space="preserve"> PAGEREF _Toc225528773 \h </w:instrText>
+            </w:r>
+            <w:r>
+              <w:rPr>
+                <w:noProof/>
+                <w:webHidden/>
+              </w:rPr>
+            </w:r>
+            <w:r>
+              <w:rPr>
+                <w:noProof/>
+                <w:webHidden/>
+              </w:rPr>
+              <w:fldChar w:fldCharType="separate"/>
+            </w:r>
+            <w:r>
+              <w:rPr>
+                <w:noProof/>
+                <w:webHidden/>
+              </w:rPr>
+              <w:t>4</w:t>
+            </w:r>
+            <w:r>
+              <w:rPr>
+                <w:noProof/>
+                <w:webHidden/>
+              </w:rPr>
+              <w:fldChar w:fldCharType="end"/>
+            </w:r>
+          </w:hyperlink>
+        </w:p>
+        <w:p>
+          <w:pPr>
+            <w:pStyle w:val="TOC1"/>
+            <w:tabs>
+              <w:tab w:val="right" w:leader="dot" w:pos="9350"/>
+            </w:tabs>
+            <w:rPr>
+              <w:rFonts w:eastAsiaTheme="minorEastAsia"/>
+              <w:noProof/>
+              <w:sz w:val="24"/>
+              <w:szCs w:val="24"/>
+            </w:rPr>
+          </w:pPr>
+          <w:hyperlink w:anchor="_Toc225528774" w:history="1">
+            <w:r>
+              <w:rPr>
+                <w:rStyle w:val="Hyperlink"/>
+                <w:noProof/>
+              </w:rPr>
+              <w:t>1) Local caching (save/load CSV to avoid repeated downloads)</w:t>
+            </w:r>
+            <w:r>
+              <w:rPr>
+                <w:noProof/>
+                <w:webHidden/>
+              </w:rPr>
+              <w:tab/>
+            </w:r>
+            <w:r>
+              <w:rPr>
+                <w:noProof/>
+                <w:webHidden/>
+              </w:rPr>
+              <w:fldChar w:fldCharType="begin"/>
+            </w:r>
+            <w:r>
+              <w:rPr>
+                <w:noProof/>
+                <w:webHidden/>
+              </w:rPr>
+              <w:instrText xml:space="preserve"> PAGEREF _Toc225528774 \h </w:instrText>
+            </w:r>
+            <w:r>
+              <w:rPr>
+                <w:noProof/>
+                <w:webHidden/>
+              </w:rPr>
+            </w:r>
+            <w:r>
+              <w:rPr>
+                <w:noProof/>
+                <w:webHidden/>
+              </w:rPr>
+              <w:fldChar w:fldCharType="separate"/>
+            </w:r>
+            <w:r>
+              <w:rPr>
+                <w:noProof/>
+                <w:webHidden/>
+              </w:rPr>
+              <w:t>4</w:t>
+            </w:r>
+            <w:r>
+              <w:rPr>
+                <w:noProof/>
+                <w:webHidden/>
+              </w:rPr>
+              <w:fldChar w:fldCharType="end"/>
+            </w:r>
+          </w:hyperlink>
+        </w:p>
+        <w:p>
+          <w:pPr>
+            <w:pStyle w:val="TOC1"/>
+            <w:tabs>
+              <w:tab w:val="right" w:leader="dot" w:pos="9350"/>
+            </w:tabs>
+            <w:rPr>
+              <w:rFonts w:eastAsiaTheme="minorEastAsia"/>
+              <w:noProof/>
+              <w:sz w:val="24"/>
+              <w:szCs w:val="24"/>
+            </w:rPr>
+          </w:pPr>
+          <w:hyperlink w:anchor="_Toc225528775" w:history="1">
+            <w:r>
+              <w:rPr>
+                <w:rStyle w:val="Hyperlink"/>
+                <w:noProof/>
+              </w:rPr>
+              <w:t>2) Selecting multiple features and enforcing a consistent schema</w:t>
+            </w:r>
+            <w:r>
+              <w:rPr>
+                <w:noProof/>
+                <w:webHidden/>
+              </w:rPr>
+              <w:tab/>
+            </w:r>
+            <w:r>
+              <w:rPr>
+                <w:noProof/>
+                <w:webHidden/>
+              </w:rPr>
+              <w:fldChar w:fldCharType="begin"/>
+            </w:r>
+            <w:r>
+              <w:rPr>
+                <w:noProof/>
+                <w:webHidden/>
+              </w:rPr>
+              <w:instrText xml:space="preserve"> PAGEREF _Toc225528775 \h </w:instrText>
+            </w:r>
+            <w:r>
+              <w:rPr>
+                <w:noProof/>
+                <w:webHidden/>
+              </w:rPr>
+            </w:r>
+            <w:r>
+              <w:rPr>
+                <w:noProof/>
+                <w:webHidden/>
+              </w:rPr>
+              <w:fldChar w:fldCharType="separate"/>
+            </w:r>
+            <w:r>
+              <w:rPr>
+                <w:noProof/>
+                <w:webHidden/>
+              </w:rPr>
+              <w:t>5</w:t>
+            </w:r>
+            <w:r>
+              <w:rPr>
+                <w:noProof/>
+                <w:webHidden/>
+              </w:rPr>
+              <w:fldChar w:fldCharType="end"/>
+            </w:r>
+          </w:hyperlink>
+        </w:p>
+        <w:p>
+          <w:pPr>
+            <w:pStyle w:val="TOC1"/>
+            <w:tabs>
+              <w:tab w:val="right" w:leader="dot" w:pos="9350"/>
+            </w:tabs>
+            <w:rPr>
+              <w:rFonts w:eastAsiaTheme="minorEastAsia"/>
+              <w:noProof/>
+              <w:sz w:val="24"/>
+              <w:szCs w:val="24"/>
+            </w:rPr>
+          </w:pPr>
+          <w:hyperlink w:anchor="_Toc225528776" w:history="1">
+            <w:r>
+              <w:rPr>
+                <w:rStyle w:val="Hyperlink"/>
+                <w:noProof/>
+              </w:rPr>
+              <w:t>3) Handling NaN / infinity properly before scaling</w:t>
+            </w:r>
+            <w:r>
+              <w:rPr>
+                <w:noProof/>
+                <w:webHidden/>
+              </w:rPr>
+              <w:tab/>
+            </w:r>
+            <w:r>
+              <w:rPr>
+                <w:noProof/>
+                <w:webHidden/>
+              </w:rPr>
+              <w:fldChar w:fldCharType="begin"/>
+            </w:r>
+            <w:r>
+              <w:rPr>
+                <w:noProof/>
+                <w:webHidden/>
+              </w:rPr>
+              <w:instrText xml:space="preserve"> PAGEREF _Toc225528776 \h </w:instrText>
+            </w:r>
+            <w:r>
+              <w:rPr>
+                <w:noProof/>
+                <w:webHidden/>
+              </w:rPr>
+            </w:r>
+            <w:r>
+              <w:rPr>
+                <w:noProof/>
+                <w:webHidden/>
+              </w:rPr>
+              <w:fldChar w:fldCharType="separate"/>
+            </w:r>
+            <w:r>
+              <w:rPr>
+                <w:noProof/>
+                <w:webHidden/>
+              </w:rPr>
+              <w:t>6</w:t>
+            </w:r>
+            <w:r>
+              <w:rPr>
+                <w:noProof/>
+                <w:webHidden/>
+              </w:rPr>
+              <w:fldChar w:fldCharType="end"/>
+            </w:r>
+          </w:hyperlink>
+        </w:p>
+        <w:p>
+          <w:pPr>
+            <w:pStyle w:val="TOC1"/>
+            <w:tabs>
+              <w:tab w:val="right" w:leader="dot" w:pos="9350"/>
+            </w:tabs>
+            <w:rPr>
+              <w:rFonts w:eastAsiaTheme="minorEastAsia"/>
+              <w:noProof/>
+              <w:sz w:val="24"/>
+              <w:szCs w:val="24"/>
+            </w:rPr>
+          </w:pPr>
+          <w:hyperlink w:anchor="_Toc225528777" w:history="1">
+            <w:r>
+              <w:rPr>
+                <w:rStyle w:val="Hyperlink"/>
+                <w:noProof/>
+              </w:rPr>
+              <w:t>4) Flexible splitting (ratio/date/random)</w:t>
+            </w:r>
+            <w:r>
+              <w:rPr>
+                <w:noProof/>
+                <w:webHidden/>
+              </w:rPr>
+              <w:tab/>
+            </w:r>
+            <w:r>
+              <w:rPr>
+                <w:noProof/>
+                <w:webHidden/>
+              </w:rPr>
+              <w:fldChar w:fldCharType="begin"/>
+            </w:r>
+            <w:r>
+              <w:rPr>
+                <w:noProof/>
+                <w:webHidden/>
+              </w:rPr>
+              <w:instrText xml:space="preserve"> PAGEREF _Toc225528777 \h </w:instrText>
+            </w:r>
+            <w:r>
+              <w:rPr>
+                <w:noProof/>
+                <w:webHidden/>
+              </w:rPr>
+            </w:r>
+            <w:r>
+              <w:rPr>
+                <w:noProof/>
+                <w:webHidden/>
+              </w:rPr>
+              <w:fldChar w:fldCharType="separate"/>
+            </w:r>
+            <w:r>
+              <w:rPr>
+                <w:noProof/>
+                <w:webHidden/>
+              </w:rPr>
+              <w:t>7</w:t>
+            </w:r>
+            <w:r>
+              <w:rPr>
+                <w:noProof/>
+                <w:webHidden/>
+              </w:rPr>
+              <w:fldChar w:fldCharType="end"/>
+            </w:r>
+          </w:hyperlink>
+        </w:p>
+        <w:p>
+          <w:pPr>
+            <w:pStyle w:val="TOC1"/>
+            <w:tabs>
+              <w:tab w:val="right" w:leader="dot" w:pos="9350"/>
+            </w:tabs>
+            <w:rPr>
+              <w:rFonts w:eastAsiaTheme="minorEastAsia"/>
+              <w:noProof/>
+              <w:sz w:val="24"/>
+              <w:szCs w:val="24"/>
+            </w:rPr>
+          </w:pPr>
+          <w:hyperlink w:anchor="_Toc225528778" w:history="1">
+            <w:r>
+              <w:rPr>
+                <w:rStyle w:val="Hyperlink"/>
+                <w:noProof/>
+              </w:rPr>
+              <w:t>5) Scaling with MinMaxScaler and storing scaler objects</w:t>
+            </w:r>
+            <w:r>
+              <w:rPr>
+                <w:noProof/>
+                <w:webHidden/>
+              </w:rPr>
+              <w:tab/>
+            </w:r>
+            <w:r>
+              <w:rPr>
+                <w:noProof/>
+                <w:webHidden/>
+              </w:rPr>
+              <w:fldChar w:fldCharType="begin"/>
+            </w:r>
+            <w:r>
+              <w:rPr>
+                <w:noProof/>
+                <w:webHidden/>
+              </w:rPr>
+              <w:instrText xml:space="preserve"> PAGEREF _Toc225528778 \h </w:instrText>
+            </w:r>
+            <w:r>
+              <w:rPr>
+                <w:noProof/>
+                <w:webHidden/>
+              </w:rPr>
+            </w:r>
+            <w:r>
+              <w:rPr>
+                <w:noProof/>
+                <w:webHidden/>
+              </w:rPr>
+              <w:fldChar w:fldCharType="separate"/>
+            </w:r>
+            <w:r>
+              <w:rPr>
+                <w:noProof/>
+                <w:webHidden/>
+              </w:rPr>
+              <w:t>8</w:t>
+            </w:r>
+            <w:r>
+              <w:rPr>
+                <w:noProof/>
+                <w:webHidden/>
+              </w:rPr>
+              <w:fldChar w:fldCharType="end"/>
+            </w:r>
+          </w:hyperlink>
+        </w:p>
+        <w:p>
+          <w:pPr>
+            <w:pStyle w:val="TOC1"/>
+            <w:tabs>
+              <w:tab w:val="right" w:leader="dot" w:pos="9350"/>
+            </w:tabs>
+            <w:rPr>
+              <w:rFonts w:eastAsiaTheme="minorEastAsia"/>
+              <w:noProof/>
+              <w:sz w:val="24"/>
+              <w:szCs w:val="24"/>
+            </w:rPr>
+          </w:pPr>
+          <w:hyperlink w:anchor="_Toc225528779" w:history="1">
+            <w:r>
+              <w:rPr>
+                <w:rStyle w:val="Hyperlink"/>
+                <w:noProof/>
+              </w:rPr>
+              <w:t>Oral Defense</w:t>
+            </w:r>
+            <w:r>
+              <w:rPr>
+                <w:noProof/>
+                <w:webHidden/>
+              </w:rPr>
+              <w:tab/>
+            </w:r>
+            <w:r>
+              <w:rPr>
+                <w:noProof/>
+                <w:webHidden/>
+              </w:rPr>
+              <w:fldChar w:fldCharType="begin"/>
+            </w:r>
+            <w:r>
+              <w:rPr>
+                <w:noProof/>
+                <w:webHidden/>
+              </w:rPr>
+              <w:instrText xml:space="preserve"> PAGEREF _Toc225528779 \h </w:instrText>
+            </w:r>
+            <w:r>
+              <w:rPr>
+                <w:noProof/>
+                <w:webHidden/>
+              </w:rPr>
+            </w:r>
+            <w:r>
+              <w:rPr>
+                <w:noProof/>
+                <w:webHidden/>
+              </w:rPr>
+              <w:fldChar w:fldCharType="separate"/>
+            </w:r>
+            <w:r>
+              <w:rPr>
+                <w:noProof/>
+                <w:webHidden/>
+              </w:rPr>
+              <w:t>9</w:t>
+            </w:r>
+            <w:r>
+              <w:rPr>
+                <w:noProof/>
+                <w:webHidden/>
+              </w:rPr>
+              <w:fldChar w:fldCharType="end"/>
+            </w:r>
+          </w:hyperlink>
+        </w:p>
+        <w:p>
+          <w:pPr>
+            <w:pStyle w:val="TOC1"/>
+            <w:tabs>
+              <w:tab w:val="right" w:leader="dot" w:pos="9350"/>
+            </w:tabs>
+            <w:rPr>
+              <w:rFonts w:eastAsiaTheme="minorEastAsia"/>
+              <w:noProof/>
+              <w:sz w:val="24"/>
+              <w:szCs w:val="24"/>
+            </w:rPr>
+          </w:pPr>
+          <w:hyperlink w:anchor="_Toc225528780" w:history="1">
+            <w:r>
+              <w:rPr>
+                <w:rStyle w:val="Hyperlink"/>
+                <w:noProof/>
+              </w:rPr>
+              <w:t>1. Beyond just the Close price, how do features like Volume or High/Low provide extra context to a Deep Learning model?</w:t>
+            </w:r>
+            <w:r>
+              <w:rPr>
+                <w:noProof/>
+                <w:webHidden/>
+              </w:rPr>
+              <w:tab/>
+            </w:r>
+            <w:r>
+              <w:rPr>
+                <w:noProof/>
+                <w:webHidden/>
+              </w:rPr>
+              <w:fldChar w:fldCharType="begin"/>
+            </w:r>
+            <w:r>
+              <w:rPr>
+                <w:noProof/>
+                <w:webHidden/>
+              </w:rPr>
+              <w:instrText xml:space="preserve"> PAGEREF _Toc225528780 \h </w:instrText>
+            </w:r>
+            <w:r>
+              <w:rPr>
+                <w:noProof/>
+                <w:webHidden/>
+              </w:rPr>
+            </w:r>
+            <w:r>
+              <w:rPr>
+                <w:noProof/>
+                <w:webHidden/>
+              </w:rPr>
+              <w:fldChar w:fldCharType="separate"/>
+            </w:r>
+            <w:r>
+              <w:rPr>
+                <w:noProof/>
+                <w:webHidden/>
+              </w:rPr>
+              <w:t>9</w:t>
+            </w:r>
+            <w:r>
+              <w:rPr>
+                <w:noProof/>
+                <w:webHidden/>
+              </w:rPr>
+              <w:fldChar w:fldCharType="end"/>
+            </w:r>
+          </w:hyperlink>
+        </w:p>
+        <w:p>
+          <w:pPr>
+            <w:pStyle w:val="TOC1"/>
+            <w:tabs>
+              <w:tab w:val="right" w:leader="dot" w:pos="9350"/>
+            </w:tabs>
+            <w:rPr>
+              <w:rFonts w:eastAsiaTheme="minorEastAsia"/>
+              <w:noProof/>
+              <w:sz w:val="24"/>
+              <w:szCs w:val="24"/>
+            </w:rPr>
+          </w:pPr>
+          <w:hyperlink w:anchor="_Toc225528781" w:history="1">
             <w:r>
               <w:rPr>
                 <w:rStyle w:val="Hyperlink"/>
@@ -889,7 +1451,7 @@
                 <w:noProof/>
                 <w:webHidden/>
               </w:rPr>
-              <w:instrText xml:space="preserve"> PAGEREF _Toc223810529 \h </w:instrText>
+              <w:instrText xml:space="preserve"> PAGEREF _Toc225528781 \h </w:instrText>
             </w:r>
             <w:r>
               <w:rPr>
@@ -909,7 +1471,7 @@
                 <w:noProof/>
                 <w:webHidden/>
               </w:rPr>
-              <w:t>3</w:t>
+              <w:t>9</w:t>
             </w:r>
             <w:r>
               <w:rPr>
@@ -933,7 +1495,7 @@
               <w:szCs w:val="24"/>
             </w:rPr>
           </w:pPr>
-          <w:hyperlink w:anchor="_Toc223810530" w:history="1">
+          <w:hyperlink w:anchor="_Toc225528782" w:history="1">
             <w:r>
               <w:rPr>
                 <w:rStyle w:val="Hyperlink"/>
@@ -960,7 +1522,7 @@
                 <w:noProof/>
                 <w:webHidden/>
               </w:rPr>
-              <w:instrText xml:space="preserve"> PAGEREF _Toc223810530 \h </w:instrText>
+              <w:instrText xml:space="preserve"> PAGEREF _Toc225528782 \h </w:instrText>
             </w:r>
             <w:r>
               <w:rPr>
@@ -980,7 +1542,7 @@
                 <w:noProof/>
                 <w:webHidden/>
               </w:rPr>
-              <w:t>3</w:t>
+              <w:t>10</w:t>
             </w:r>
             <w:r>
               <w:rPr>
@@ -992,11 +1554,19 @@
           </w:hyperlink>
         </w:p>
         <w:p>
+          <w:pPr>
+            <w:rPr>
+              <w:sz w:val="24"/>
+              <w:szCs w:val="24"/>
+            </w:rPr>
+          </w:pPr>
           <w:r>
             <w:rPr>
               <w:b/>
               <w:bCs/>
               <w:noProof/>
+              <w:sz w:val="24"/>
+              <w:szCs w:val="24"/>
             </w:rPr>
             <w:fldChar w:fldCharType="end"/>
           </w:r>
@@ -1011,8 +1581,8 @@
           <w:bCs/>
           <w:color w:val="000000"/>
           <w:kern w:val="0"/>
-          <w:sz w:val="36"/>
-          <w:szCs w:val="36"/>
+          <w:sz w:val="24"/>
+          <w:szCs w:val="24"/>
           <w14:ligatures w14:val="none"/>
         </w:rPr>
       </w:pPr>
@@ -1025,8 +1595,8 @@
           <w:bCs/>
           <w:color w:val="000000"/>
           <w:kern w:val="0"/>
-          <w:sz w:val="36"/>
-          <w:szCs w:val="36"/>
+          <w:sz w:val="24"/>
+          <w:szCs w:val="24"/>
           <w14:ligatures w14:val="none"/>
         </w:rPr>
       </w:pPr>
@@ -1039,8 +1609,8 @@
           <w:bCs/>
           <w:color w:val="000000"/>
           <w:kern w:val="0"/>
-          <w:sz w:val="36"/>
-          <w:szCs w:val="36"/>
+          <w:sz w:val="24"/>
+          <w:szCs w:val="24"/>
           <w14:ligatures w14:val="none"/>
         </w:rPr>
       </w:pPr>
@@ -1053,8 +1623,8 @@
           <w:bCs/>
           <w:color w:val="000000"/>
           <w:kern w:val="0"/>
-          <w:sz w:val="36"/>
-          <w:szCs w:val="36"/>
+          <w:sz w:val="24"/>
+          <w:szCs w:val="24"/>
           <w14:ligatures w14:val="none"/>
         </w:rPr>
       </w:pPr>
@@ -1067,8 +1637,8 @@
           <w:bCs/>
           <w:color w:val="000000"/>
           <w:kern w:val="0"/>
-          <w:sz w:val="36"/>
-          <w:szCs w:val="36"/>
+          <w:sz w:val="24"/>
+          <w:szCs w:val="24"/>
           <w14:ligatures w14:val="none"/>
         </w:rPr>
       </w:pPr>
@@ -1081,8 +1651,8 @@
           <w:bCs/>
           <w:color w:val="000000"/>
           <w:kern w:val="0"/>
-          <w:sz w:val="36"/>
-          <w:szCs w:val="36"/>
+          <w:sz w:val="24"/>
+          <w:szCs w:val="24"/>
           <w14:ligatures w14:val="none"/>
         </w:rPr>
       </w:pPr>
@@ -1095,8 +1665,8 @@
           <w:bCs/>
           <w:color w:val="000000"/>
           <w:kern w:val="0"/>
-          <w:sz w:val="36"/>
-          <w:szCs w:val="36"/>
+          <w:sz w:val="24"/>
+          <w:szCs w:val="24"/>
           <w14:ligatures w14:val="none"/>
         </w:rPr>
       </w:pPr>
@@ -1108,6 +1678,8 @@
           <w:rFonts w:eastAsia="Times New Roman"/>
           <w:b/>
           <w:bCs/>
+          <w:sz w:val="24"/>
+          <w:szCs w:val="24"/>
         </w:rPr>
       </w:pPr>
     </w:p>
@@ -1118,6 +1690,8 @@
           <w:rFonts w:eastAsia="Times New Roman"/>
           <w:b/>
           <w:bCs/>
+          <w:sz w:val="24"/>
+          <w:szCs w:val="24"/>
         </w:rPr>
       </w:pPr>
     </w:p>
@@ -1128,6 +1702,8 @@
           <w:rFonts w:eastAsia="Times New Roman"/>
           <w:b/>
           <w:bCs/>
+          <w:sz w:val="24"/>
+          <w:szCs w:val="24"/>
         </w:rPr>
       </w:pPr>
     </w:p>
@@ -1138,6 +1714,8 @@
           <w:rFonts w:eastAsia="Times New Roman"/>
           <w:b/>
           <w:bCs/>
+          <w:sz w:val="24"/>
+          <w:szCs w:val="24"/>
           <w:lang w:val="vi-VN"/>
         </w:rPr>
       </w:pPr>
@@ -1152,125 +1730,111 @@
     </w:p>
     <w:p>
       <w:pPr>
+        <w:rPr>
+          <w:sz w:val="24"/>
+          <w:szCs w:val="24"/>
+          <w:lang w:val="vi-VN"/>
+        </w:rPr>
+      </w:pPr>
+    </w:p>
+    <w:p>
+      <w:pPr>
+        <w:rPr>
+          <w:sz w:val="24"/>
+          <w:szCs w:val="24"/>
+          <w:lang w:val="vi-VN"/>
+        </w:rPr>
+      </w:pPr>
+    </w:p>
+    <w:p>
+      <w:pPr>
+        <w:rPr>
+          <w:sz w:val="24"/>
+          <w:szCs w:val="24"/>
+          <w:lang w:val="vi-VN"/>
+        </w:rPr>
+      </w:pPr>
+    </w:p>
+    <w:p>
+      <w:pPr>
+        <w:rPr>
+          <w:sz w:val="24"/>
+          <w:szCs w:val="24"/>
+          <w:lang w:val="vi-VN"/>
+        </w:rPr>
+      </w:pPr>
+    </w:p>
+    <w:p>
+      <w:pPr>
+        <w:rPr>
+          <w:sz w:val="24"/>
+          <w:szCs w:val="24"/>
+          <w:lang w:val="vi-VN"/>
+        </w:rPr>
+      </w:pPr>
+    </w:p>
+    <w:p>
+      <w:pPr>
+        <w:rPr>
+          <w:sz w:val="24"/>
+          <w:szCs w:val="24"/>
+          <w:lang w:val="vi-VN"/>
+        </w:rPr>
+      </w:pPr>
+    </w:p>
+    <w:p>
+      <w:pPr>
+        <w:rPr>
+          <w:sz w:val="24"/>
+          <w:szCs w:val="24"/>
+          <w:lang w:val="vi-VN"/>
+        </w:rPr>
+      </w:pPr>
+    </w:p>
+    <w:p>
+      <w:pPr>
         <w:pStyle w:val="Heading1"/>
-      </w:pPr>
-      <w:bookmarkStart w:id="0" w:name="_Toc223810528"/>
-      <w:r>
-        <w:lastRenderedPageBreak/>
-        <w:t xml:space="preserve">1. </w:t>
-      </w:r>
-      <w:r>
-        <w:t>Beyond just the Close price, how do features like Volume or High/Low provide extra context to a Deep Learning model?</w:t>
+        <w:rPr>
+          <w:sz w:val="24"/>
+          <w:szCs w:val="24"/>
+        </w:rPr>
+      </w:pPr>
+      <w:bookmarkStart w:id="0" w:name="_Toc225528772"/>
+      <w:r>
+        <w:rPr>
+          <w:sz w:val="24"/>
+          <w:szCs w:val="24"/>
+        </w:rPr>
+        <w:t>Evidence of execution (from my notebook output)</w:t>
       </w:r>
       <w:bookmarkEnd w:id="0"/>
     </w:p>
-    <w:p/>
-    <w:p>
-      <w:pPr>
-        <w:rPr>
-          <w:sz w:val="24"/>
-          <w:szCs w:val="24"/>
-        </w:rPr>
-      </w:pPr>
-      <w:r>
-        <w:rPr>
-          <w:sz w:val="24"/>
-          <w:szCs w:val="24"/>
-        </w:rPr>
-        <w:t>Using only the closing price gives the model a limited view of the market. Adding High, Low, and Volume gives more context about what happened during each trading day. High and Low show the price range and help the model understand volatility. Volume shows how much trading activity happened, which may indicate stronger market interest or pressure. Because of this, the model can learn patterns from both price movement and trading behaviour, instead of relying on just one value.</w:t>
-      </w:r>
-    </w:p>
-    <w:p>
-      <w:pPr>
-        <w:rPr>
-          <w:sz w:val="24"/>
-          <w:szCs w:val="24"/>
-        </w:rPr>
-      </w:pPr>
-    </w:p>
-    <w:p>
-      <w:pPr>
-        <w:pStyle w:val="Heading1"/>
-      </w:pPr>
-      <w:bookmarkStart w:id="1" w:name="_Toc223810529"/>
-      <w:r>
-        <w:t>2</w:t>
-      </w:r>
-      <w:r>
-        <w:t xml:space="preserve">. </w:t>
-      </w:r>
-      <w:r>
-        <w:t>How does your system handle NaN values in the historical stock data? Why is it better to handle these during preprocessing rather than letting the model process them?</w:t>
-      </w:r>
-      <w:bookmarkEnd w:id="1"/>
-    </w:p>
-    <w:p/>
-    <w:p>
-      <w:pPr>
-        <w:rPr>
-          <w:sz w:val="24"/>
-          <w:szCs w:val="24"/>
-        </w:rPr>
-      </w:pPr>
-      <w:r>
-        <w:rPr>
-          <w:sz w:val="24"/>
-          <w:szCs w:val="24"/>
-        </w:rPr>
-        <w:t>The system handles NaN values during preprocessing using forward fill and backward fill. This means missing values are replaced using nearby valid values before the data is scaled or turned into sequences. This is better than leaving NaN values for the model because neural networks do not work well with missing data. If NaN values are left in the dataset, they can break scaling, cause unstable training, or lead to invalid predictions. Cleaning them early makes the input data consistent and usable.</w:t>
-      </w:r>
-    </w:p>
-    <w:p>
-      <w:pPr>
-        <w:rPr>
-          <w:sz w:val="24"/>
-          <w:szCs w:val="24"/>
-        </w:rPr>
-      </w:pPr>
-    </w:p>
-    <w:p>
-      <w:pPr>
-        <w:pStyle w:val="Heading1"/>
-      </w:pPr>
-      <w:bookmarkStart w:id="2" w:name="_Toc223810530"/>
-      <w:r>
-        <w:t>3</w:t>
-      </w:r>
-      <w:r>
-        <w:t xml:space="preserve">. </w:t>
-      </w:r>
-      <w:r>
-        <w:t>Explain the logic of scaling your data using MinMaxScaler. Why must we store the scaler object to inverse transform the results later?</w:t>
-      </w:r>
-      <w:bookmarkEnd w:id="2"/>
-    </w:p>
-    <w:p/>
-    <w:p>
-      <w:pPr>
-        <w:rPr>
-          <w:sz w:val="24"/>
-          <w:szCs w:val="24"/>
-        </w:rPr>
-      </w:pPr>
-      <w:r>
-        <w:rPr>
-          <w:sz w:val="24"/>
-          <w:szCs w:val="24"/>
-        </w:rPr>
-        <w:t>MinMaxScaler is used to transform the values into a similar range, usually between 0 and 1. This is important because the features in stock data can be very different in size. For example, Volume can be much larger than Close, High, or Low. If the data is not scaled, the larger values may dominate the training process and make learning less stable. The scaler object must be stored because the model predicts values in scaled form. To convert those predictions back into real stock prices, the same fitted scaler must be used again through inverse transformation.</w:t>
-      </w:r>
-    </w:p>
-    <w:p>
-      <w:pPr>
-        <w:pStyle w:val="Heading1"/>
-      </w:pPr>
-      <w:r>
-        <w:lastRenderedPageBreak/>
+    <w:p>
+      <w:pPr>
+        <w:rPr>
+          <w:sz w:val="24"/>
+          <w:szCs w:val="24"/>
+        </w:rPr>
+      </w:pPr>
+    </w:p>
+    <w:p>
+      <w:pPr>
+        <w:rPr>
+          <w:sz w:val="24"/>
+          <w:szCs w:val="24"/>
+        </w:rPr>
+      </w:pPr>
+      <w:r>
+        <w:rPr>
+          <w:noProof/>
+          <w:sz w:val="24"/>
+          <w:szCs w:val="24"/>
+        </w:rPr>
         <w:drawing>
-          <wp:inline distT="0" distB="0" distL="0" distR="0" wp14:anchorId="34A0EB1E" wp14:editId="21DD0DB9">
-            <wp:extent cx="5943600" cy="3504565"/>
-            <wp:effectExtent l="0" t="0" r="0" b="635"/>
-            <wp:docPr id="1526853463" name="Picture 1"/>
+          <wp:inline distT="0" distB="0" distL="0" distR="0" wp14:anchorId="102F76C9" wp14:editId="07ECB30C">
+            <wp:extent cx="4333333" cy="2657143"/>
+            <wp:effectExtent l="0" t="0" r="0" b="0"/>
+            <wp:docPr id="246071372" name="Picture 1"/>
             <wp:cNvGraphicFramePr>
               <a:graphicFrameLocks xmlns:a="http://schemas.openxmlformats.org/drawingml/2006/main" noChangeAspect="1"/>
             </wp:cNvGraphicFramePr>
@@ -1278,7 +1842,7 @@
               <a:graphicData uri="http://schemas.openxmlformats.org/drawingml/2006/picture">
                 <pic:pic xmlns:pic="http://schemas.openxmlformats.org/drawingml/2006/picture">
                   <pic:nvPicPr>
-                    <pic:cNvPr id="1526853463" name=""/>
+                    <pic:cNvPr id="246071372" name=""/>
                     <pic:cNvPicPr/>
                   </pic:nvPicPr>
                   <pic:blipFill>
@@ -1290,7 +1854,7 @@
                   <pic:spPr>
                     <a:xfrm>
                       <a:off x="0" y="0"/>
-                      <a:ext cx="5943600" cy="3504565"/>
+                      <a:ext cx="4333333" cy="2657143"/>
                     </a:xfrm>
                     <a:prstGeom prst="rect">
                       <a:avLst/>
@@ -1303,8 +1867,1912 @@
         </w:drawing>
       </w:r>
     </w:p>
+    <w:p>
+      <w:pPr>
+        <w:rPr>
+          <w:sz w:val="24"/>
+          <w:szCs w:val="24"/>
+        </w:rPr>
+      </w:pPr>
+    </w:p>
+    <w:p>
+      <w:pPr>
+        <w:rPr>
+          <w:sz w:val="24"/>
+          <w:szCs w:val="24"/>
+        </w:rPr>
+      </w:pPr>
+      <w:r>
+        <w:rPr>
+          <w:sz w:val="24"/>
+          <w:szCs w:val="24"/>
+        </w:rPr>
+        <w:t>The data loading pipeline successfully produced:</w:t>
+      </w:r>
+    </w:p>
+    <w:p>
+      <w:pPr>
+        <w:pStyle w:val="ListParagraph"/>
+        <w:numPr>
+          <w:ilvl w:val="0"/>
+          <w:numId w:val="50"/>
+        </w:numPr>
+        <w:rPr>
+          <w:sz w:val="24"/>
+          <w:szCs w:val="24"/>
+        </w:rPr>
+      </w:pPr>
+      <w:r>
+        <w:rPr>
+          <w:sz w:val="24"/>
+          <w:szCs w:val="24"/>
+        </w:rPr>
+        <w:t>Raw shape: (1137, 5) and Clean shape: (1137, 5)</w:t>
+      </w:r>
+    </w:p>
+    <w:p>
+      <w:pPr>
+        <w:pStyle w:val="ListParagraph"/>
+        <w:numPr>
+          <w:ilvl w:val="0"/>
+          <w:numId w:val="50"/>
+        </w:numPr>
+        <w:rPr>
+          <w:sz w:val="24"/>
+          <w:szCs w:val="24"/>
+        </w:rPr>
+      </w:pPr>
+      <w:r>
+        <w:rPr>
+          <w:sz w:val="24"/>
+          <w:szCs w:val="24"/>
+        </w:rPr>
+        <w:t>Train/Test shapes: (906, 5) and (231, 5)</w:t>
+      </w:r>
+    </w:p>
+    <w:p>
+      <w:pPr>
+        <w:pStyle w:val="ListParagraph"/>
+        <w:numPr>
+          <w:ilvl w:val="0"/>
+          <w:numId w:val="50"/>
+        </w:numPr>
+        <w:rPr>
+          <w:sz w:val="24"/>
+          <w:szCs w:val="24"/>
+        </w:rPr>
+      </w:pPr>
+      <w:r>
+        <w:rPr>
+          <w:sz w:val="24"/>
+          <w:szCs w:val="24"/>
+        </w:rPr>
+        <w:t>Scaler keys: ['all_features', 'feature_columns', 'target_column']</w:t>
+      </w:r>
+    </w:p>
+    <w:p>
+      <w:pPr>
+        <w:pStyle w:val="ListParagraph"/>
+        <w:numPr>
+          <w:ilvl w:val="0"/>
+          <w:numId w:val="50"/>
+        </w:numPr>
+        <w:rPr>
+          <w:sz w:val="24"/>
+          <w:szCs w:val="24"/>
+        </w:rPr>
+      </w:pPr>
+      <w:r>
+        <w:rPr>
+          <w:sz w:val="24"/>
+          <w:szCs w:val="24"/>
+        </w:rPr>
+        <w:t>The preview table shows scaled OHLCV values in [0,1], confirming MinMax scaling was applied.</w:t>
+      </w:r>
+    </w:p>
+    <w:p>
+      <w:pPr>
+        <w:rPr>
+          <w:sz w:val="24"/>
+          <w:szCs w:val="24"/>
+          <w:lang w:val="vi-VN"/>
+        </w:rPr>
+      </w:pPr>
+    </w:p>
+    <w:p>
+      <w:pPr>
+        <w:rPr>
+          <w:sz w:val="24"/>
+          <w:szCs w:val="24"/>
+          <w:lang w:val="vi-VN"/>
+        </w:rPr>
+      </w:pPr>
+    </w:p>
+    <w:p>
+      <w:pPr>
+        <w:rPr>
+          <w:sz w:val="24"/>
+          <w:szCs w:val="24"/>
+          <w:lang w:val="vi-VN"/>
+        </w:rPr>
+      </w:pPr>
+    </w:p>
+    <w:p>
+      <w:pPr>
+        <w:rPr>
+          <w:sz w:val="24"/>
+          <w:szCs w:val="24"/>
+          <w:lang w:val="vi-VN"/>
+        </w:rPr>
+      </w:pPr>
+    </w:p>
+    <w:p>
+      <w:pPr>
+        <w:rPr>
+          <w:sz w:val="24"/>
+          <w:szCs w:val="24"/>
+          <w:lang w:val="vi-VN"/>
+        </w:rPr>
+      </w:pPr>
+    </w:p>
+    <w:p>
+      <w:pPr>
+        <w:rPr>
+          <w:sz w:val="24"/>
+          <w:szCs w:val="24"/>
+          <w:lang w:val="vi-VN"/>
+        </w:rPr>
+      </w:pPr>
+    </w:p>
+    <w:p>
+      <w:pPr>
+        <w:rPr>
+          <w:sz w:val="24"/>
+          <w:szCs w:val="24"/>
+          <w:lang w:val="vi-VN"/>
+        </w:rPr>
+      </w:pPr>
+    </w:p>
+    <w:p>
+      <w:pPr>
+        <w:rPr>
+          <w:sz w:val="24"/>
+          <w:szCs w:val="24"/>
+          <w:lang w:val="vi-VN"/>
+        </w:rPr>
+      </w:pPr>
+    </w:p>
+    <w:p>
+      <w:pPr>
+        <w:rPr>
+          <w:sz w:val="24"/>
+          <w:szCs w:val="24"/>
+          <w:lang w:val="vi-VN"/>
+        </w:rPr>
+      </w:pPr>
+    </w:p>
+    <w:p>
+      <w:pPr>
+        <w:rPr>
+          <w:sz w:val="24"/>
+          <w:szCs w:val="24"/>
+          <w:lang w:val="vi-VN"/>
+        </w:rPr>
+      </w:pPr>
+    </w:p>
+    <w:p>
+      <w:pPr>
+        <w:pStyle w:val="Heading1"/>
+      </w:pPr>
+      <w:bookmarkStart w:id="1" w:name="_Toc225528773"/>
+      <w:r>
+        <w:t>Summary of effort: explaining the less straightforward code lines</w:t>
+      </w:r>
+      <w:bookmarkEnd w:id="1"/>
+    </w:p>
+    <w:p>
+      <w:pPr>
+        <w:rPr>
+          <w:sz w:val="24"/>
+          <w:szCs w:val="24"/>
+        </w:rPr>
+      </w:pPr>
+      <w:r>
+        <w:rPr>
+          <w:sz w:val="24"/>
+          <w:szCs w:val="24"/>
+        </w:rPr>
+        <w:t>This task required implementing a reusable data loading function that supports (1) multiple features, (2) NaN handling, (3) flexible splitting, (4) caching, and (5) scaling with saved scalers. Below I explain the lines that were not obvious and required research.</w:t>
+      </w:r>
+    </w:p>
+    <w:p>
+      <w:pPr>
+        <w:pStyle w:val="Heading1"/>
+      </w:pPr>
+      <w:bookmarkStart w:id="2" w:name="_Toc225528774"/>
+      <w:r>
+        <w:t>1) Local caching (save/load CSV to avoid repeated downloads)</w:t>
+      </w:r>
+      <w:bookmarkEnd w:id="2"/>
+    </w:p>
+    <w:p>
+      <w:pPr>
+        <w:rPr>
+          <w:sz w:val="24"/>
+          <w:szCs w:val="24"/>
+        </w:rPr>
+      </w:pPr>
+      <w:r>
+        <w:rPr>
+          <w:sz w:val="24"/>
+          <w:szCs w:val="24"/>
+        </w:rPr>
+        <w:t xml:space="preserve">Why it’s non-trivial: yfinance downloads can be slow/unreliable, and repeated calls waste time. I researched how to </w:t>
+      </w:r>
+      <w:r>
+        <w:rPr>
+          <w:sz w:val="24"/>
+          <w:szCs w:val="24"/>
+        </w:rPr>
+        <w:t>persist in</w:t>
+      </w:r>
+      <w:r>
+        <w:rPr>
+          <w:sz w:val="24"/>
+          <w:szCs w:val="24"/>
+        </w:rPr>
+        <w:t xml:space="preserve"> the downloaded DataFrame to a CSV and reload it later while keeping the DateTime index intact.</w:t>
+      </w:r>
+    </w:p>
+    <w:p>
+      <w:pPr>
+        <w:rPr>
+          <w:sz w:val="24"/>
+          <w:szCs w:val="24"/>
+        </w:rPr>
+      </w:pPr>
+    </w:p>
+    <w:p>
+      <w:pPr>
+        <w:rPr>
+          <w:b/>
+          <w:bCs/>
+          <w:sz w:val="24"/>
+          <w:szCs w:val="24"/>
+        </w:rPr>
+      </w:pPr>
+      <w:r>
+        <w:rPr>
+          <w:b/>
+          <w:bCs/>
+          <w:sz w:val="24"/>
+          <w:szCs w:val="24"/>
+        </w:rPr>
+        <w:t>Key lines &amp; reasoning:</w:t>
+      </w:r>
+    </w:p>
+    <w:p>
+      <w:pPr>
+        <w:pStyle w:val="ListParagraph"/>
+        <w:numPr>
+          <w:ilvl w:val="0"/>
+          <w:numId w:val="51"/>
+        </w:numPr>
+        <w:rPr>
+          <w:sz w:val="24"/>
+          <w:szCs w:val="24"/>
+        </w:rPr>
+      </w:pPr>
+      <w:r>
+        <w:rPr>
+          <w:sz w:val="24"/>
+          <w:szCs w:val="24"/>
+        </w:rPr>
+        <w:t>os.makedirs(cache_dir, exist_ok=True)</w:t>
+      </w:r>
+      <w:r>
+        <w:rPr>
+          <w:sz w:val="24"/>
+          <w:szCs w:val="24"/>
+        </w:rPr>
+        <w:t>- Create</w:t>
+      </w:r>
+      <w:r>
+        <w:rPr>
+          <w:sz w:val="24"/>
+          <w:szCs w:val="24"/>
+        </w:rPr>
+        <w:t xml:space="preserve"> the cache folder if it doesn’t exist (prevents crash when saving the first time).</w:t>
+      </w:r>
+    </w:p>
+    <w:p>
+      <w:pPr>
+        <w:pStyle w:val="ListParagraph"/>
+        <w:rPr>
+          <w:sz w:val="24"/>
+          <w:szCs w:val="24"/>
+        </w:rPr>
+      </w:pPr>
+      <w:r>
+        <w:rPr>
+          <w:sz w:val="24"/>
+          <w:szCs w:val="24"/>
+        </w:rPr>
+        <w:drawing>
+          <wp:inline distT="0" distB="0" distL="0" distR="0" wp14:anchorId="12A30312" wp14:editId="12B99632">
+            <wp:extent cx="5734850" cy="543001"/>
+            <wp:effectExtent l="0" t="0" r="0" b="9525"/>
+            <wp:docPr id="1656009725" name="Picture 1"/>
+            <wp:cNvGraphicFramePr>
+              <a:graphicFrameLocks xmlns:a="http://schemas.openxmlformats.org/drawingml/2006/main" noChangeAspect="1"/>
+            </wp:cNvGraphicFramePr>
+            <a:graphic xmlns:a="http://schemas.openxmlformats.org/drawingml/2006/main">
+              <a:graphicData uri="http://schemas.openxmlformats.org/drawingml/2006/picture">
+                <pic:pic xmlns:pic="http://schemas.openxmlformats.org/drawingml/2006/picture">
+                  <pic:nvPicPr>
+                    <pic:cNvPr id="1656009725" name=""/>
+                    <pic:cNvPicPr/>
+                  </pic:nvPicPr>
+                  <pic:blipFill>
+                    <a:blip r:embed="rId10"/>
+                    <a:stretch>
+                      <a:fillRect/>
+                    </a:stretch>
+                  </pic:blipFill>
+                  <pic:spPr>
+                    <a:xfrm>
+                      <a:off x="0" y="0"/>
+                      <a:ext cx="5734850" cy="543001"/>
+                    </a:xfrm>
+                    <a:prstGeom prst="rect">
+                      <a:avLst/>
+                    </a:prstGeom>
+                  </pic:spPr>
+                </pic:pic>
+              </a:graphicData>
+            </a:graphic>
+          </wp:inline>
+        </w:drawing>
+      </w:r>
+    </w:p>
+    <w:p>
+      <w:pPr>
+        <w:pStyle w:val="ListParagraph"/>
+        <w:rPr>
+          <w:sz w:val="24"/>
+          <w:szCs w:val="24"/>
+        </w:rPr>
+      </w:pPr>
+    </w:p>
+    <w:p>
+      <w:pPr>
+        <w:pStyle w:val="ListParagraph"/>
+        <w:numPr>
+          <w:ilvl w:val="0"/>
+          <w:numId w:val="51"/>
+        </w:numPr>
+        <w:rPr>
+          <w:sz w:val="24"/>
+          <w:szCs w:val="24"/>
+        </w:rPr>
+      </w:pPr>
+      <w:r>
+        <w:rPr>
+          <w:sz w:val="24"/>
+          <w:szCs w:val="24"/>
+        </w:rPr>
+        <w:t>df.to_csv(cache_path) and pd.read_csv(cache_path, index_col=0, parse_dates=True)</w:t>
+      </w:r>
+      <w:r>
+        <w:rPr>
+          <w:sz w:val="24"/>
+          <w:szCs w:val="24"/>
+        </w:rPr>
+        <w:t xml:space="preserve">- </w:t>
+      </w:r>
+      <w:r>
+        <w:rPr>
+          <w:sz w:val="24"/>
+          <w:szCs w:val="24"/>
+        </w:rPr>
+        <w:t>I used index_col=0 + parse_dates=True so the “Date” column becomes a proper datetime index again after loading, which is important for time-based operations (like interpolation and date splits).</w:t>
+      </w:r>
+    </w:p>
+    <w:p>
+      <w:pPr>
+        <w:pStyle w:val="ListParagraph"/>
+        <w:rPr>
+          <w:sz w:val="24"/>
+          <w:szCs w:val="24"/>
+        </w:rPr>
+      </w:pPr>
+      <w:r>
+        <w:rPr>
+          <w:sz w:val="24"/>
+          <w:szCs w:val="24"/>
+        </w:rPr>
+        <w:lastRenderedPageBreak/>
+        <w:drawing>
+          <wp:inline distT="0" distB="0" distL="0" distR="0" wp14:anchorId="6D6DB8B9" wp14:editId="6923D1FD">
+            <wp:extent cx="5943600" cy="4067810"/>
+            <wp:effectExtent l="0" t="0" r="0" b="8890"/>
+            <wp:docPr id="62885613" name="Picture 1"/>
+            <wp:cNvGraphicFramePr>
+              <a:graphicFrameLocks xmlns:a="http://schemas.openxmlformats.org/drawingml/2006/main" noChangeAspect="1"/>
+            </wp:cNvGraphicFramePr>
+            <a:graphic xmlns:a="http://schemas.openxmlformats.org/drawingml/2006/main">
+              <a:graphicData uri="http://schemas.openxmlformats.org/drawingml/2006/picture">
+                <pic:pic xmlns:pic="http://schemas.openxmlformats.org/drawingml/2006/picture">
+                  <pic:nvPicPr>
+                    <pic:cNvPr id="62885613" name=""/>
+                    <pic:cNvPicPr/>
+                  </pic:nvPicPr>
+                  <pic:blipFill>
+                    <a:blip r:embed="rId11"/>
+                    <a:stretch>
+                      <a:fillRect/>
+                    </a:stretch>
+                  </pic:blipFill>
+                  <pic:spPr>
+                    <a:xfrm>
+                      <a:off x="0" y="0"/>
+                      <a:ext cx="5943600" cy="4067810"/>
+                    </a:xfrm>
+                    <a:prstGeom prst="rect">
+                      <a:avLst/>
+                    </a:prstGeom>
+                  </pic:spPr>
+                </pic:pic>
+              </a:graphicData>
+            </a:graphic>
+          </wp:inline>
+        </w:drawing>
+      </w:r>
+    </w:p>
+    <w:p>
+      <w:pPr>
+        <w:rPr>
+          <w:sz w:val="24"/>
+          <w:szCs w:val="24"/>
+        </w:rPr>
+      </w:pPr>
+    </w:p>
+    <w:p>
+      <w:pPr>
+        <w:pStyle w:val="Heading1"/>
+        <w:rPr>
+          <w:lang w:val="vi-VN"/>
+        </w:rPr>
+      </w:pPr>
+      <w:bookmarkStart w:id="3" w:name="_Toc225528775"/>
+      <w:r>
+        <w:t>2) Selecting multiple features and enforcing a consistent schema</w:t>
+      </w:r>
+      <w:bookmarkEnd w:id="3"/>
+    </w:p>
+    <w:p>
+      <w:pPr>
+        <w:rPr>
+          <w:lang w:val="vi-VN"/>
+        </w:rPr>
+      </w:pPr>
+    </w:p>
+    <w:p>
+      <w:pPr>
+        <w:rPr>
+          <w:sz w:val="24"/>
+          <w:szCs w:val="24"/>
+        </w:rPr>
+      </w:pPr>
+      <w:r>
+        <w:rPr>
+          <w:sz w:val="24"/>
+          <w:szCs w:val="24"/>
+        </w:rPr>
+        <w:t>Why it’s non-trivial: Deep learning inputs must have consistent dimensions across time. I researched best practice to explicitly select columns and keep the same column order.</w:t>
+      </w:r>
+    </w:p>
+    <w:p>
+      <w:pPr>
+        <w:rPr>
+          <w:sz w:val="24"/>
+          <w:szCs w:val="24"/>
+        </w:rPr>
+      </w:pPr>
+    </w:p>
+    <w:p>
+      <w:pPr>
+        <w:rPr>
+          <w:b/>
+          <w:bCs/>
+          <w:sz w:val="24"/>
+          <w:szCs w:val="24"/>
+        </w:rPr>
+      </w:pPr>
+      <w:r>
+        <w:rPr>
+          <w:b/>
+          <w:bCs/>
+          <w:sz w:val="24"/>
+          <w:szCs w:val="24"/>
+        </w:rPr>
+        <w:t>Key lines &amp; reasoning:</w:t>
+      </w:r>
+    </w:p>
+    <w:p>
+      <w:pPr>
+        <w:pStyle w:val="ListParagraph"/>
+        <w:numPr>
+          <w:ilvl w:val="0"/>
+          <w:numId w:val="51"/>
+        </w:numPr>
+        <w:rPr>
+          <w:sz w:val="24"/>
+          <w:szCs w:val="24"/>
+        </w:rPr>
+      </w:pPr>
+      <w:r>
+        <w:rPr>
+          <w:sz w:val="24"/>
+          <w:szCs w:val="24"/>
+        </w:rPr>
+        <w:t>df = df[feature_cols].copy()</w:t>
+      </w:r>
+      <w:r>
+        <w:rPr>
+          <w:sz w:val="24"/>
+          <w:szCs w:val="24"/>
+        </w:rPr>
+        <w:t xml:space="preserve">- </w:t>
+      </w:r>
+      <w:r>
+        <w:rPr>
+          <w:sz w:val="24"/>
+          <w:szCs w:val="24"/>
+        </w:rPr>
+        <w:t>Keeps only the needed columns (e.g., Open/High/Low/Close/Volume). .copy() avoids pandas “SettingWithCopyWarning” and prevents unintended mutation of the original data.</w:t>
+      </w:r>
+    </w:p>
+    <w:p>
+      <w:pPr>
+        <w:rPr>
+          <w:sz w:val="24"/>
+          <w:szCs w:val="24"/>
+        </w:rPr>
+      </w:pPr>
+      <w:r>
+        <w:rPr>
+          <w:sz w:val="24"/>
+          <w:szCs w:val="24"/>
+        </w:rPr>
+        <w:lastRenderedPageBreak/>
+        <w:drawing>
+          <wp:inline distT="0" distB="0" distL="0" distR="0" wp14:anchorId="77E2E10D" wp14:editId="38CA0288">
+            <wp:extent cx="5943600" cy="2867025"/>
+            <wp:effectExtent l="0" t="0" r="0" b="9525"/>
+            <wp:docPr id="92309511" name="Picture 1"/>
+            <wp:cNvGraphicFramePr>
+              <a:graphicFrameLocks xmlns:a="http://schemas.openxmlformats.org/drawingml/2006/main" noChangeAspect="1"/>
+            </wp:cNvGraphicFramePr>
+            <a:graphic xmlns:a="http://schemas.openxmlformats.org/drawingml/2006/main">
+              <a:graphicData uri="http://schemas.openxmlformats.org/drawingml/2006/picture">
+                <pic:pic xmlns:pic="http://schemas.openxmlformats.org/drawingml/2006/picture">
+                  <pic:nvPicPr>
+                    <pic:cNvPr id="92309511" name=""/>
+                    <pic:cNvPicPr/>
+                  </pic:nvPicPr>
+                  <pic:blipFill>
+                    <a:blip r:embed="rId12"/>
+                    <a:stretch>
+                      <a:fillRect/>
+                    </a:stretch>
+                  </pic:blipFill>
+                  <pic:spPr>
+                    <a:xfrm>
+                      <a:off x="0" y="0"/>
+                      <a:ext cx="5943600" cy="2867025"/>
+                    </a:xfrm>
+                    <a:prstGeom prst="rect">
+                      <a:avLst/>
+                    </a:prstGeom>
+                  </pic:spPr>
+                </pic:pic>
+              </a:graphicData>
+            </a:graphic>
+          </wp:inline>
+        </w:drawing>
+      </w:r>
+    </w:p>
+    <w:p>
+      <w:pPr>
+        <w:rPr>
+          <w:sz w:val="24"/>
+          <w:szCs w:val="24"/>
+        </w:rPr>
+      </w:pPr>
+    </w:p>
+    <w:p>
+      <w:pPr>
+        <w:pStyle w:val="Heading1"/>
+      </w:pPr>
+      <w:bookmarkStart w:id="4" w:name="_Toc225528776"/>
+      <w:r>
+        <w:t>3) Handling NaN / infinity properly before scaling</w:t>
+      </w:r>
+      <w:bookmarkEnd w:id="4"/>
+    </w:p>
+    <w:p>
+      <w:pPr>
+        <w:rPr>
+          <w:sz w:val="24"/>
+          <w:szCs w:val="24"/>
+        </w:rPr>
+      </w:pPr>
+    </w:p>
+    <w:p>
+      <w:pPr>
+        <w:rPr>
+          <w:sz w:val="24"/>
+          <w:szCs w:val="24"/>
+        </w:rPr>
+      </w:pPr>
+      <w:r>
+        <w:rPr>
+          <w:sz w:val="24"/>
+          <w:szCs w:val="24"/>
+        </w:rPr>
+        <w:t>Why it’s non-trivial: NaNs can come from missing trading days, incomplete data feeds, or invalid values. Also, some transforms can introduce inf or -inf. Scalers and neural networks cannot handle NaN values.</w:t>
+      </w:r>
+    </w:p>
+    <w:p>
+      <w:pPr>
+        <w:rPr>
+          <w:b/>
+          <w:bCs/>
+          <w:sz w:val="24"/>
+          <w:szCs w:val="24"/>
+        </w:rPr>
+      </w:pPr>
+      <w:r>
+        <w:rPr>
+          <w:b/>
+          <w:bCs/>
+          <w:sz w:val="24"/>
+          <w:szCs w:val="24"/>
+        </w:rPr>
+        <w:t>Key lines &amp; reasoning:</w:t>
+      </w:r>
+    </w:p>
+    <w:p>
+      <w:pPr>
+        <w:pStyle w:val="ListParagraph"/>
+        <w:numPr>
+          <w:ilvl w:val="0"/>
+          <w:numId w:val="51"/>
+        </w:numPr>
+        <w:rPr>
+          <w:sz w:val="24"/>
+          <w:szCs w:val="24"/>
+        </w:rPr>
+      </w:pPr>
+      <w:r>
+        <w:rPr>
+          <w:sz w:val="24"/>
+          <w:szCs w:val="24"/>
+        </w:rPr>
+        <w:t>df.replace([np.inf, -np.inf], np.nan, inplace=True)</w:t>
+      </w:r>
+      <w:r>
+        <w:rPr>
+          <w:sz w:val="24"/>
+          <w:szCs w:val="24"/>
+        </w:rPr>
+        <w:t xml:space="preserve">- </w:t>
+      </w:r>
+      <w:r>
+        <w:rPr>
+          <w:sz w:val="24"/>
+          <w:szCs w:val="24"/>
+        </w:rPr>
+        <w:t>Converts invalid infinities into NaN so they can be handled by a single missing-data strategy.</w:t>
+      </w:r>
+    </w:p>
+    <w:p>
+      <w:pPr>
+        <w:pStyle w:val="ListParagraph"/>
+        <w:rPr>
+          <w:sz w:val="24"/>
+          <w:szCs w:val="24"/>
+        </w:rPr>
+      </w:pPr>
+      <w:r>
+        <w:rPr>
+          <w:sz w:val="24"/>
+          <w:szCs w:val="24"/>
+        </w:rPr>
+        <w:drawing>
+          <wp:inline distT="0" distB="0" distL="0" distR="0" wp14:anchorId="09C408F1" wp14:editId="4097CA43">
+            <wp:extent cx="5591955" cy="2381582"/>
+            <wp:effectExtent l="0" t="0" r="8890" b="0"/>
+            <wp:docPr id="296574626" name="Picture 1"/>
+            <wp:cNvGraphicFramePr>
+              <a:graphicFrameLocks xmlns:a="http://schemas.openxmlformats.org/drawingml/2006/main" noChangeAspect="1"/>
+            </wp:cNvGraphicFramePr>
+            <a:graphic xmlns:a="http://schemas.openxmlformats.org/drawingml/2006/main">
+              <a:graphicData uri="http://schemas.openxmlformats.org/drawingml/2006/picture">
+                <pic:pic xmlns:pic="http://schemas.openxmlformats.org/drawingml/2006/picture">
+                  <pic:nvPicPr>
+                    <pic:cNvPr id="296574626" name=""/>
+                    <pic:cNvPicPr/>
+                  </pic:nvPicPr>
+                  <pic:blipFill>
+                    <a:blip r:embed="rId13"/>
+                    <a:stretch>
+                      <a:fillRect/>
+                    </a:stretch>
+                  </pic:blipFill>
+                  <pic:spPr>
+                    <a:xfrm>
+                      <a:off x="0" y="0"/>
+                      <a:ext cx="5591955" cy="2381582"/>
+                    </a:xfrm>
+                    <a:prstGeom prst="rect">
+                      <a:avLst/>
+                    </a:prstGeom>
+                  </pic:spPr>
+                </pic:pic>
+              </a:graphicData>
+            </a:graphic>
+          </wp:inline>
+        </w:drawing>
+      </w:r>
+    </w:p>
+    <w:p>
+      <w:pPr>
+        <w:pStyle w:val="ListParagraph"/>
+        <w:numPr>
+          <w:ilvl w:val="0"/>
+          <w:numId w:val="51"/>
+        </w:numPr>
+        <w:rPr>
+          <w:sz w:val="24"/>
+          <w:szCs w:val="24"/>
+        </w:rPr>
+      </w:pPr>
+      <w:r>
+        <w:rPr>
+          <w:sz w:val="24"/>
+          <w:szCs w:val="24"/>
+        </w:rPr>
+        <w:t>NaN strategies (research-based options):</w:t>
+      </w:r>
+    </w:p>
+    <w:p>
+      <w:pPr>
+        <w:pStyle w:val="ListParagraph"/>
+        <w:numPr>
+          <w:ilvl w:val="1"/>
+          <w:numId w:val="51"/>
+        </w:numPr>
+        <w:rPr>
+          <w:sz w:val="24"/>
+          <w:szCs w:val="24"/>
+        </w:rPr>
+      </w:pPr>
+      <w:r>
+        <w:rPr>
+          <w:sz w:val="24"/>
+          <w:szCs w:val="24"/>
+        </w:rPr>
+        <w:lastRenderedPageBreak/>
+        <w:t>df.ffill().bfill()</w:t>
+      </w:r>
+      <w:r>
+        <w:rPr>
+          <w:sz w:val="24"/>
+          <w:szCs w:val="24"/>
+        </w:rPr>
+        <w:t xml:space="preserve">- </w:t>
+      </w:r>
+      <w:r>
+        <w:rPr>
+          <w:sz w:val="24"/>
+          <w:szCs w:val="24"/>
+        </w:rPr>
+        <w:t>Forward-fill uses the previous valid value; back-fill covers NaNs at the beginning. This is a common baseline for time series continuity.</w:t>
+      </w:r>
+    </w:p>
+    <w:p>
+      <w:pPr>
+        <w:pStyle w:val="ListParagraph"/>
+        <w:numPr>
+          <w:ilvl w:val="1"/>
+          <w:numId w:val="51"/>
+        </w:numPr>
+        <w:rPr>
+          <w:sz w:val="24"/>
+          <w:szCs w:val="24"/>
+        </w:rPr>
+      </w:pPr>
+      <w:r>
+        <w:rPr>
+          <w:sz w:val="24"/>
+          <w:szCs w:val="24"/>
+        </w:rPr>
+        <w:t>df.interpolate(method="time").ffill().bfill()</w:t>
+      </w:r>
+      <w:r>
+        <w:rPr>
+          <w:sz w:val="24"/>
+          <w:szCs w:val="24"/>
+        </w:rPr>
+        <w:t xml:space="preserve">- </w:t>
+      </w:r>
+      <w:r>
+        <w:rPr>
+          <w:sz w:val="24"/>
+          <w:szCs w:val="24"/>
+        </w:rPr>
+        <w:t>Time-based interpolation can smooth missing segments; I included it as an option since it is useful when gaps are small.</w:t>
+      </w:r>
+    </w:p>
+    <w:p>
+      <w:pPr>
+        <w:pStyle w:val="ListParagraph"/>
+        <w:numPr>
+          <w:ilvl w:val="1"/>
+          <w:numId w:val="51"/>
+        </w:numPr>
+        <w:rPr>
+          <w:sz w:val="24"/>
+          <w:szCs w:val="24"/>
+        </w:rPr>
+      </w:pPr>
+      <w:r>
+        <w:rPr>
+          <w:sz w:val="24"/>
+          <w:szCs w:val="24"/>
+        </w:rPr>
+        <w:t>df.dropna()</w:t>
+      </w:r>
+      <w:r>
+        <w:rPr>
+          <w:sz w:val="24"/>
+          <w:szCs w:val="24"/>
+        </w:rPr>
+        <w:t xml:space="preserve"> -</w:t>
+      </w:r>
+      <w:r>
+        <w:rPr>
+          <w:sz w:val="24"/>
+          <w:szCs w:val="24"/>
+        </w:rPr>
+        <w:t>Removes rows with missing values; simplest but can reduce dataset size and break continuity.</w:t>
+      </w:r>
+    </w:p>
+    <w:p>
+      <w:pPr>
+        <w:pStyle w:val="NormalWeb"/>
+      </w:pPr>
+      <w:r>
+        <w:t>I chose a strategy option so the function can adapt to different data situations.</w:t>
+      </w:r>
+    </w:p>
+    <w:p>
+      <w:pPr>
+        <w:pStyle w:val="Heading1"/>
+      </w:pPr>
+      <w:bookmarkStart w:id="5" w:name="_Toc225528777"/>
+      <w:r>
+        <w:t>4) Flexible splitting (ratio/date/random)</w:t>
+      </w:r>
+      <w:bookmarkEnd w:id="5"/>
+    </w:p>
+    <w:p>
+      <w:pPr>
+        <w:rPr>
+          <w:sz w:val="24"/>
+          <w:szCs w:val="24"/>
+          <w:lang w:val="vi-VN"/>
+        </w:rPr>
+      </w:pPr>
+      <w:r>
+        <w:rPr>
+          <w:sz w:val="24"/>
+          <w:szCs w:val="24"/>
+        </w:rPr>
+        <w:t>Why it’s non-trivial: The split must not leak future information into training. For time series, date split is the most correct. I researched how to implement date splits safely and how to do random split only if explicitly requested.</w:t>
+      </w:r>
+    </w:p>
+    <w:p>
+      <w:pPr>
+        <w:rPr>
+          <w:b/>
+          <w:bCs/>
+          <w:sz w:val="24"/>
+          <w:szCs w:val="24"/>
+          <w:lang w:val="vi-VN"/>
+        </w:rPr>
+      </w:pPr>
+      <w:r>
+        <w:rPr>
+          <w:b/>
+          <w:bCs/>
+          <w:sz w:val="24"/>
+          <w:szCs w:val="24"/>
+          <w:lang w:val="vi-VN"/>
+        </w:rPr>
+        <w:t>Key lines &amp; reasoning:</w:t>
+      </w:r>
+    </w:p>
+    <w:p>
+      <w:pPr>
+        <w:pStyle w:val="ListParagraph"/>
+        <w:numPr>
+          <w:ilvl w:val="0"/>
+          <w:numId w:val="51"/>
+        </w:numPr>
+        <w:rPr>
+          <w:sz w:val="24"/>
+          <w:szCs w:val="24"/>
+          <w:lang w:val="vi-VN"/>
+        </w:rPr>
+      </w:pPr>
+      <w:r>
+        <w:rPr>
+          <w:sz w:val="24"/>
+          <w:szCs w:val="24"/>
+          <w:lang w:val="vi-VN"/>
+        </w:rPr>
+        <w:t>Ratio split: split_idx = int(len(df) * train_ratio)</w:t>
+      </w:r>
+      <w:r>
+        <w:rPr>
+          <w:sz w:val="24"/>
+          <w:szCs w:val="24"/>
+          <w:lang w:val="vi-VN"/>
+        </w:rPr>
+        <w:t xml:space="preserve">- </w:t>
+      </w:r>
+      <w:r>
+        <w:rPr>
+          <w:sz w:val="24"/>
+          <w:szCs w:val="24"/>
+          <w:lang w:val="vi-VN"/>
+        </w:rPr>
+        <w:t>Simple deterministic split, maintains time order.</w:t>
+      </w:r>
+    </w:p>
+    <w:p>
+      <w:pPr>
+        <w:pStyle w:val="ListParagraph"/>
+        <w:numPr>
+          <w:ilvl w:val="0"/>
+          <w:numId w:val="51"/>
+        </w:numPr>
+        <w:rPr>
+          <w:sz w:val="24"/>
+          <w:szCs w:val="24"/>
+          <w:lang w:val="vi-VN"/>
+        </w:rPr>
+      </w:pPr>
+      <w:r>
+        <w:rPr>
+          <w:sz w:val="24"/>
+          <w:szCs w:val="24"/>
+          <w:lang w:val="vi-VN"/>
+        </w:rPr>
+        <w:t xml:space="preserve">Date split: using pd.to_datetime(split_date) + searching index to find where test </w:t>
+      </w:r>
+      <w:r>
+        <w:rPr>
+          <w:sz w:val="24"/>
+          <w:szCs w:val="24"/>
+          <w:lang w:val="vi-VN"/>
+        </w:rPr>
+        <w:t xml:space="preserve">begins. </w:t>
+      </w:r>
+      <w:r>
+        <w:rPr>
+          <w:sz w:val="24"/>
+          <w:szCs w:val="24"/>
+          <w:lang w:val="vi-VN"/>
+        </w:rPr>
+        <w:t>This ensures all samples before the split date are training and after are testing.</w:t>
+      </w:r>
+    </w:p>
+    <w:p>
+      <w:pPr>
+        <w:pStyle w:val="ListParagraph"/>
+        <w:numPr>
+          <w:ilvl w:val="0"/>
+          <w:numId w:val="51"/>
+        </w:numPr>
+        <w:rPr>
+          <w:sz w:val="24"/>
+          <w:szCs w:val="24"/>
+          <w:lang w:val="vi-VN"/>
+        </w:rPr>
+      </w:pPr>
+      <w:r>
+        <w:rPr>
+          <w:sz w:val="24"/>
+          <w:szCs w:val="24"/>
+          <w:lang w:val="vi-VN"/>
+        </w:rPr>
+        <w:t>Random split (optional): using a shuffled index (only if asked)</w:t>
+      </w:r>
+      <w:r>
+        <w:rPr>
+          <w:sz w:val="24"/>
+          <w:szCs w:val="24"/>
+          <w:lang w:val="vi-VN"/>
+        </w:rPr>
+        <w:t xml:space="preserve">. </w:t>
+      </w:r>
+      <w:r>
+        <w:rPr>
+          <w:sz w:val="24"/>
+          <w:szCs w:val="24"/>
+          <w:lang w:val="vi-VN"/>
+        </w:rPr>
+        <w:t>I included it as an option but understand it is not ideal for forecasting (it can leak future context). That’s why it’s only used when the split method is set to random.</w:t>
+      </w:r>
+    </w:p>
+    <w:p>
+      <w:pPr>
+        <w:pStyle w:val="ListParagraph"/>
+        <w:rPr>
+          <w:sz w:val="24"/>
+          <w:szCs w:val="24"/>
+          <w:lang w:val="vi-VN"/>
+        </w:rPr>
+      </w:pPr>
+      <w:r>
+        <w:rPr>
+          <w:sz w:val="24"/>
+          <w:szCs w:val="24"/>
+          <w:lang w:val="vi-VN"/>
+        </w:rPr>
+        <w:drawing>
+          <wp:inline distT="0" distB="0" distL="0" distR="0" wp14:anchorId="7277C462" wp14:editId="77B5C8FA">
+            <wp:extent cx="5430008" cy="3553321"/>
+            <wp:effectExtent l="0" t="0" r="0" b="9525"/>
+            <wp:docPr id="678356275" name="Picture 1"/>
+            <wp:cNvGraphicFramePr>
+              <a:graphicFrameLocks xmlns:a="http://schemas.openxmlformats.org/drawingml/2006/main" noChangeAspect="1"/>
+            </wp:cNvGraphicFramePr>
+            <a:graphic xmlns:a="http://schemas.openxmlformats.org/drawingml/2006/main">
+              <a:graphicData uri="http://schemas.openxmlformats.org/drawingml/2006/picture">
+                <pic:pic xmlns:pic="http://schemas.openxmlformats.org/drawingml/2006/picture">
+                  <pic:nvPicPr>
+                    <pic:cNvPr id="678356275" name=""/>
+                    <pic:cNvPicPr/>
+                  </pic:nvPicPr>
+                  <pic:blipFill>
+                    <a:blip r:embed="rId14"/>
+                    <a:stretch>
+                      <a:fillRect/>
+                    </a:stretch>
+                  </pic:blipFill>
+                  <pic:spPr>
+                    <a:xfrm>
+                      <a:off x="0" y="0"/>
+                      <a:ext cx="5430008" cy="3553321"/>
+                    </a:xfrm>
+                    <a:prstGeom prst="rect">
+                      <a:avLst/>
+                    </a:prstGeom>
+                  </pic:spPr>
+                </pic:pic>
+              </a:graphicData>
+            </a:graphic>
+          </wp:inline>
+        </w:drawing>
+      </w:r>
+    </w:p>
+    <w:p>
+      <w:pPr>
+        <w:pStyle w:val="ListParagraph"/>
+        <w:rPr>
+          <w:sz w:val="24"/>
+          <w:szCs w:val="24"/>
+          <w:lang w:val="vi-VN"/>
+        </w:rPr>
+      </w:pPr>
+    </w:p>
+    <w:p>
+      <w:pPr>
+        <w:pStyle w:val="Heading1"/>
+      </w:pPr>
+      <w:bookmarkStart w:id="6" w:name="_Toc225528778"/>
+      <w:r>
+        <w:lastRenderedPageBreak/>
+        <w:t>5) Scaling with MinMaxScaler and storing scaler objects</w:t>
+      </w:r>
+      <w:bookmarkEnd w:id="6"/>
+    </w:p>
+    <w:p>
+      <w:pPr>
+        <w:rPr>
+          <w:sz w:val="24"/>
+          <w:szCs w:val="24"/>
+          <w:lang w:val="vi-VN"/>
+        </w:rPr>
+      </w:pPr>
+      <w:r>
+        <w:rPr>
+          <w:sz w:val="24"/>
+          <w:szCs w:val="24"/>
+          <w:lang w:val="vi-VN"/>
+        </w:rPr>
+        <w:t>Why it’s non-trivial: Scaling must be fit on training data only to avoid data leakage. Also, predictions must be converted back to real prices (inverse-transform), requiring the original scaler.</w:t>
+      </w:r>
+    </w:p>
+    <w:p>
+      <w:pPr>
+        <w:rPr>
+          <w:sz w:val="24"/>
+          <w:szCs w:val="24"/>
+        </w:rPr>
+      </w:pPr>
+      <w:r>
+        <w:rPr>
+          <w:b/>
+          <w:bCs/>
+          <w:sz w:val="24"/>
+          <w:szCs w:val="24"/>
+        </w:rPr>
+        <w:t>Key lines &amp; reasoning:</w:t>
+      </w:r>
+    </w:p>
+    <w:p>
+      <w:pPr>
+        <w:pStyle w:val="ListParagraph"/>
+        <w:numPr>
+          <w:ilvl w:val="0"/>
+          <w:numId w:val="53"/>
+        </w:numPr>
+        <w:rPr>
+          <w:sz w:val="24"/>
+          <w:szCs w:val="24"/>
+        </w:rPr>
+      </w:pPr>
+      <w:r>
+        <w:rPr>
+          <w:sz w:val="24"/>
+          <w:szCs w:val="24"/>
+        </w:rPr>
+        <w:t>x_scaler.fit(train_features) (fit ONLY on training)</w:t>
+      </w:r>
+      <w:r>
+        <w:rPr>
+          <w:sz w:val="24"/>
+          <w:szCs w:val="24"/>
+          <w:lang w:val="vi-VN"/>
+        </w:rPr>
+        <w:t xml:space="preserve">. </w:t>
+      </w:r>
+      <w:r>
+        <w:rPr>
+          <w:sz w:val="24"/>
+          <w:szCs w:val="24"/>
+        </w:rPr>
+        <w:t>Avoids using test distribution to normalize training → prevents leakage.</w:t>
+      </w:r>
+    </w:p>
+    <w:p>
+      <w:pPr>
+        <w:pStyle w:val="ListParagraph"/>
+        <w:numPr>
+          <w:ilvl w:val="0"/>
+          <w:numId w:val="53"/>
+        </w:numPr>
+        <w:rPr>
+          <w:sz w:val="24"/>
+          <w:szCs w:val="24"/>
+        </w:rPr>
+      </w:pPr>
+      <w:r>
+        <w:rPr>
+          <w:sz w:val="24"/>
+          <w:szCs w:val="24"/>
+        </w:rPr>
+        <w:t>X_scaled = x_scaler.transform(full_features)</w:t>
+      </w:r>
+      <w:r>
+        <w:rPr>
+          <w:sz w:val="24"/>
+          <w:szCs w:val="24"/>
+          <w:lang w:val="vi-VN"/>
+        </w:rPr>
+        <w:t xml:space="preserve">. </w:t>
+      </w:r>
+      <w:r>
+        <w:rPr>
+          <w:sz w:val="24"/>
+          <w:szCs w:val="24"/>
+        </w:rPr>
+        <w:t>After fitting, apply the same scaling consistently to train and test.</w:t>
+      </w:r>
+    </w:p>
+    <w:p>
+      <w:pPr>
+        <w:pStyle w:val="ListParagraph"/>
+        <w:numPr>
+          <w:ilvl w:val="0"/>
+          <w:numId w:val="53"/>
+        </w:numPr>
+        <w:rPr>
+          <w:sz w:val="24"/>
+          <w:szCs w:val="24"/>
+        </w:rPr>
+      </w:pPr>
+      <w:r>
+        <w:rPr>
+          <w:sz w:val="24"/>
+          <w:szCs w:val="24"/>
+        </w:rPr>
+        <w:t>Saving scalers into a structured object (as shown by “Scaler keys” in output):</w:t>
+      </w:r>
+    </w:p>
+    <w:p>
+      <w:pPr>
+        <w:pStyle w:val="ListParagraph"/>
+        <w:numPr>
+          <w:ilvl w:val="0"/>
+          <w:numId w:val="53"/>
+        </w:numPr>
+        <w:rPr>
+          <w:sz w:val="24"/>
+          <w:szCs w:val="24"/>
+        </w:rPr>
+      </w:pPr>
+      <w:r>
+        <w:rPr>
+          <w:sz w:val="24"/>
+          <w:szCs w:val="24"/>
+        </w:rPr>
+        <w:t>scalers = {'all_features': x_scaler, 'feature_columns': feature_cols, 'target_column': target_col}</w:t>
+      </w:r>
+      <w:r>
+        <w:rPr>
+          <w:sz w:val="24"/>
+          <w:szCs w:val="24"/>
+          <w:lang w:val="vi-VN"/>
+        </w:rPr>
+        <w:t xml:space="preserve">. </w:t>
+      </w:r>
+      <w:r>
+        <w:rPr>
+          <w:sz w:val="24"/>
+          <w:szCs w:val="24"/>
+        </w:rPr>
+        <w:t>This makes the preprocessing reproducible and ensures I can inverse-transform predictions later.</w:t>
+      </w:r>
+    </w:p>
+    <w:p>
+      <w:pPr>
+        <w:jc w:val="center"/>
+        <w:rPr>
+          <w:sz w:val="24"/>
+          <w:szCs w:val="24"/>
+          <w:lang w:val="vi-VN"/>
+        </w:rPr>
+      </w:pPr>
+      <w:r>
+        <w:rPr>
+          <w:sz w:val="24"/>
+          <w:szCs w:val="24"/>
+          <w:lang w:val="vi-VN"/>
+        </w:rPr>
+        <w:drawing>
+          <wp:inline distT="0" distB="0" distL="0" distR="0" wp14:anchorId="340D963D" wp14:editId="08498360">
+            <wp:extent cx="4829849" cy="4258269"/>
+            <wp:effectExtent l="0" t="0" r="8890" b="9525"/>
+            <wp:docPr id="1637844752" name="Picture 1"/>
+            <wp:cNvGraphicFramePr>
+              <a:graphicFrameLocks xmlns:a="http://schemas.openxmlformats.org/drawingml/2006/main" noChangeAspect="1"/>
+            </wp:cNvGraphicFramePr>
+            <a:graphic xmlns:a="http://schemas.openxmlformats.org/drawingml/2006/main">
+              <a:graphicData uri="http://schemas.openxmlformats.org/drawingml/2006/picture">
+                <pic:pic xmlns:pic="http://schemas.openxmlformats.org/drawingml/2006/picture">
+                  <pic:nvPicPr>
+                    <pic:cNvPr id="1637844752" name=""/>
+                    <pic:cNvPicPr/>
+                  </pic:nvPicPr>
+                  <pic:blipFill>
+                    <a:blip r:embed="rId15"/>
+                    <a:stretch>
+                      <a:fillRect/>
+                    </a:stretch>
+                  </pic:blipFill>
+                  <pic:spPr>
+                    <a:xfrm>
+                      <a:off x="0" y="0"/>
+                      <a:ext cx="4829849" cy="4258269"/>
+                    </a:xfrm>
+                    <a:prstGeom prst="rect">
+                      <a:avLst/>
+                    </a:prstGeom>
+                  </pic:spPr>
+                </pic:pic>
+              </a:graphicData>
+            </a:graphic>
+          </wp:inline>
+        </w:drawing>
+      </w:r>
+    </w:p>
+    <w:p>
+      <w:pPr>
+        <w:jc w:val="center"/>
+        <w:rPr>
+          <w:sz w:val="24"/>
+          <w:szCs w:val="24"/>
+          <w:lang w:val="vi-VN"/>
+        </w:rPr>
+      </w:pPr>
+    </w:p>
+    <w:p>
+      <w:pPr>
+        <w:jc w:val="center"/>
+        <w:rPr>
+          <w:sz w:val="24"/>
+          <w:szCs w:val="24"/>
+          <w:lang w:val="vi-VN"/>
+        </w:rPr>
+      </w:pPr>
+    </w:p>
+    <w:p>
+      <w:pPr>
+        <w:jc w:val="center"/>
+        <w:rPr>
+          <w:sz w:val="24"/>
+          <w:szCs w:val="24"/>
+          <w:lang w:val="vi-VN"/>
+        </w:rPr>
+      </w:pPr>
+    </w:p>
+    <w:p>
+      <w:pPr>
+        <w:pStyle w:val="Heading1"/>
+        <w:rPr>
+          <w:sz w:val="24"/>
+          <w:szCs w:val="24"/>
+          <w:lang w:val="vi-VN"/>
+        </w:rPr>
+      </w:pPr>
+      <w:bookmarkStart w:id="7" w:name="_Toc225528779"/>
+      <w:r>
+        <w:rPr>
+          <w:sz w:val="24"/>
+          <w:szCs w:val="24"/>
+        </w:rPr>
+        <w:lastRenderedPageBreak/>
+        <w:t>Oral Defense</w:t>
+      </w:r>
+      <w:bookmarkEnd w:id="7"/>
+    </w:p>
+    <w:p>
+      <w:pPr>
+        <w:pStyle w:val="Heading1"/>
+      </w:pPr>
+      <w:bookmarkStart w:id="8" w:name="_Toc225528780"/>
+      <w:r>
+        <w:t xml:space="preserve">1. </w:t>
+      </w:r>
+      <w:r>
+        <w:t>Beyond just the Close price, how do features like Volume or High/Low provide extra context to a Deep Learning model?</w:t>
+      </w:r>
+      <w:bookmarkEnd w:id="8"/>
+    </w:p>
+    <w:p>
+      <w:pPr>
+        <w:rPr>
+          <w:sz w:val="24"/>
+          <w:szCs w:val="24"/>
+        </w:rPr>
+      </w:pPr>
+    </w:p>
+    <w:p>
+      <w:pPr>
+        <w:rPr>
+          <w:sz w:val="24"/>
+          <w:szCs w:val="24"/>
+          <w:lang w:val="vi-VN"/>
+        </w:rPr>
+      </w:pPr>
+      <w:r>
+        <w:rPr>
+          <w:sz w:val="24"/>
+          <w:szCs w:val="24"/>
+        </w:rPr>
+        <w:t>Using only Close tells the model the final price each day but hides intraday behavior and market activity. Adding:</w:t>
+      </w:r>
+    </w:p>
+    <w:p>
+      <w:pPr>
+        <w:pStyle w:val="ListParagraph"/>
+        <w:numPr>
+          <w:ilvl w:val="0"/>
+          <w:numId w:val="54"/>
+        </w:numPr>
+        <w:rPr>
+          <w:sz w:val="24"/>
+          <w:szCs w:val="24"/>
+        </w:rPr>
+      </w:pPr>
+      <w:r>
+        <w:rPr>
+          <w:sz w:val="24"/>
+          <w:szCs w:val="24"/>
+        </w:rPr>
+        <w:t>High/Low gives the daily trading range (volatility). A day with the same Close can have very different High/Low ranges, which can signal uncertainty or strong swings.</w:t>
+      </w:r>
+    </w:p>
+    <w:p>
+      <w:pPr>
+        <w:pStyle w:val="ListParagraph"/>
+        <w:numPr>
+          <w:ilvl w:val="0"/>
+          <w:numId w:val="54"/>
+        </w:numPr>
+        <w:rPr>
+          <w:sz w:val="24"/>
+          <w:szCs w:val="24"/>
+        </w:rPr>
+      </w:pPr>
+      <w:r>
+        <w:rPr>
+          <w:sz w:val="24"/>
+          <w:szCs w:val="24"/>
+        </w:rPr>
+        <w:t>Open helps represent gaps and early market movement (especially useful in trend changes).</w:t>
+      </w:r>
+    </w:p>
+    <w:p>
+      <w:pPr>
+        <w:pStyle w:val="ListParagraph"/>
+        <w:numPr>
+          <w:ilvl w:val="0"/>
+          <w:numId w:val="54"/>
+        </w:numPr>
+        <w:rPr>
+          <w:sz w:val="24"/>
+          <w:szCs w:val="24"/>
+        </w:rPr>
+      </w:pPr>
+      <w:r>
+        <w:rPr>
+          <w:sz w:val="24"/>
+          <w:szCs w:val="24"/>
+        </w:rPr>
+        <w:t>Volume gives activity/strength behind the price move. A price increase with high volume is often more meaningful than the same increase with low volume.</w:t>
+      </w:r>
+    </w:p>
+    <w:p>
+      <w:pPr>
+        <w:rPr>
+          <w:sz w:val="24"/>
+          <w:szCs w:val="24"/>
+        </w:rPr>
+      </w:pPr>
+      <w:r>
+        <w:rPr>
+          <w:sz w:val="24"/>
+          <w:szCs w:val="24"/>
+        </w:rPr>
+        <w:t>In my notebook, the multi-feature dataset output confirms the model input includes OHLCV, not only Close, which provides richer context for the deep learning model</w:t>
+      </w:r>
+      <w:r>
+        <w:rPr>
+          <w:sz w:val="24"/>
+          <w:szCs w:val="24"/>
+        </w:rPr>
+        <w:t>.</w:t>
+      </w:r>
+    </w:p>
+    <w:p>
+      <w:pPr>
+        <w:rPr>
+          <w:sz w:val="24"/>
+          <w:szCs w:val="24"/>
+        </w:rPr>
+      </w:pPr>
+    </w:p>
+    <w:p>
+      <w:pPr>
+        <w:pStyle w:val="Heading1"/>
+      </w:pPr>
+      <w:bookmarkStart w:id="9" w:name="_Toc225528781"/>
+      <w:r>
+        <w:t>2</w:t>
+      </w:r>
+      <w:r>
+        <w:t xml:space="preserve">. </w:t>
+      </w:r>
+      <w:r>
+        <w:t>How does your system handle NaN values in the historical stock data? Why is it better to handle these during preprocessing rather than letting the model process them?</w:t>
+      </w:r>
+      <w:bookmarkEnd w:id="9"/>
+    </w:p>
+    <w:p>
+      <w:pPr>
+        <w:rPr>
+          <w:sz w:val="24"/>
+          <w:szCs w:val="24"/>
+        </w:rPr>
+      </w:pPr>
+    </w:p>
+    <w:p>
+      <w:pPr>
+        <w:rPr>
+          <w:sz w:val="24"/>
+          <w:szCs w:val="24"/>
+          <w:lang w:val="vi-VN"/>
+        </w:rPr>
+      </w:pPr>
+      <w:r>
+        <w:rPr>
+          <w:sz w:val="24"/>
+          <w:szCs w:val="24"/>
+        </w:rPr>
+        <w:t>My system handles NaNs during preprocessing by:</w:t>
+      </w:r>
+    </w:p>
+    <w:p>
+      <w:pPr>
+        <w:pStyle w:val="ListParagraph"/>
+        <w:numPr>
+          <w:ilvl w:val="0"/>
+          <w:numId w:val="55"/>
+        </w:numPr>
+        <w:rPr>
+          <w:sz w:val="24"/>
+          <w:szCs w:val="24"/>
+        </w:rPr>
+      </w:pPr>
+      <w:r>
+        <w:rPr>
+          <w:sz w:val="24"/>
+          <w:szCs w:val="24"/>
+        </w:rPr>
+        <w:t>converting invalid inf/-inf to NaN, then</w:t>
+      </w:r>
+    </w:p>
+    <w:p>
+      <w:pPr>
+        <w:pStyle w:val="ListParagraph"/>
+        <w:numPr>
+          <w:ilvl w:val="0"/>
+          <w:numId w:val="55"/>
+        </w:numPr>
+        <w:rPr>
+          <w:sz w:val="24"/>
+          <w:szCs w:val="24"/>
+        </w:rPr>
+      </w:pPr>
+      <w:r>
+        <w:rPr>
+          <w:sz w:val="24"/>
+          <w:szCs w:val="24"/>
+        </w:rPr>
+        <w:t>applying a chosen missing-data strategy (default: forward-fill + back-fill).</w:t>
+      </w:r>
+    </w:p>
+    <w:p>
+      <w:pPr>
+        <w:rPr>
+          <w:sz w:val="24"/>
+          <w:szCs w:val="24"/>
+          <w:lang w:val="vi-VN"/>
+        </w:rPr>
+      </w:pPr>
+      <w:r>
+        <w:rPr>
+          <w:sz w:val="24"/>
+          <w:szCs w:val="24"/>
+        </w:rPr>
+        <w:t>It is better to handle NaNs in preprocessing because:</w:t>
+      </w:r>
+    </w:p>
+    <w:p>
+      <w:pPr>
+        <w:pStyle w:val="ListParagraph"/>
+        <w:numPr>
+          <w:ilvl w:val="0"/>
+          <w:numId w:val="56"/>
+        </w:numPr>
+        <w:rPr>
+          <w:sz w:val="24"/>
+          <w:szCs w:val="24"/>
+        </w:rPr>
+      </w:pPr>
+      <w:r>
+        <w:rPr>
+          <w:sz w:val="24"/>
+          <w:szCs w:val="24"/>
+        </w:rPr>
+        <w:t>Neural networks and scalers cannot compute meaningful gradients or transformations with NaN values (NaNs can propagate and break training).</w:t>
+      </w:r>
+    </w:p>
+    <w:p>
+      <w:pPr>
+        <w:pStyle w:val="ListParagraph"/>
+        <w:numPr>
+          <w:ilvl w:val="0"/>
+          <w:numId w:val="56"/>
+        </w:numPr>
+        <w:rPr>
+          <w:sz w:val="24"/>
+          <w:szCs w:val="24"/>
+        </w:rPr>
+      </w:pPr>
+      <w:r>
+        <w:rPr>
+          <w:sz w:val="24"/>
+          <w:szCs w:val="24"/>
+        </w:rPr>
+        <w:t>Handling missing values early ensures consistent sequences and stable numerical behavior.</w:t>
+      </w:r>
+    </w:p>
+    <w:p>
+      <w:pPr>
+        <w:pStyle w:val="ListParagraph"/>
+        <w:numPr>
+          <w:ilvl w:val="0"/>
+          <w:numId w:val="56"/>
+        </w:numPr>
+        <w:rPr>
+          <w:sz w:val="24"/>
+          <w:szCs w:val="24"/>
+        </w:rPr>
+      </w:pPr>
+      <w:r>
+        <w:rPr>
+          <w:sz w:val="24"/>
+          <w:szCs w:val="24"/>
+        </w:rPr>
+        <w:t>It avoids hidden failures later (e.g., model outputs becoming NaN).</w:t>
+      </w:r>
+    </w:p>
+    <w:p>
+      <w:pPr>
+        <w:rPr>
+          <w:sz w:val="24"/>
+          <w:szCs w:val="24"/>
+          <w:lang w:val="vi-VN"/>
+        </w:rPr>
+      </w:pPr>
+      <w:r>
+        <w:rPr>
+          <w:sz w:val="24"/>
+          <w:szCs w:val="24"/>
+        </w:rPr>
+        <w:t>This is confirmed by the output showing Raw shape = Clean shape, meaning NaNs did not force row drops for this dataset, and the pipeline remained stable.</w:t>
+      </w:r>
+    </w:p>
+    <w:p>
+      <w:pPr>
+        <w:rPr>
+          <w:sz w:val="24"/>
+          <w:szCs w:val="24"/>
+          <w:lang w:val="vi-VN"/>
+        </w:rPr>
+      </w:pPr>
+    </w:p>
+    <w:p>
+      <w:pPr>
+        <w:rPr>
+          <w:sz w:val="24"/>
+          <w:szCs w:val="24"/>
+          <w:lang w:val="vi-VN"/>
+        </w:rPr>
+      </w:pPr>
+    </w:p>
+    <w:p>
+      <w:pPr>
+        <w:rPr>
+          <w:sz w:val="24"/>
+          <w:szCs w:val="24"/>
+          <w:lang w:val="vi-VN"/>
+        </w:rPr>
+      </w:pPr>
+    </w:p>
+    <w:p>
+      <w:pPr>
+        <w:rPr>
+          <w:sz w:val="24"/>
+          <w:szCs w:val="24"/>
+          <w:lang w:val="vi-VN"/>
+        </w:rPr>
+      </w:pPr>
+    </w:p>
+    <w:p>
+      <w:pPr>
+        <w:pStyle w:val="Heading1"/>
+      </w:pPr>
+      <w:bookmarkStart w:id="10" w:name="_Toc225528782"/>
+      <w:r>
+        <w:t>3</w:t>
+      </w:r>
+      <w:r>
+        <w:t xml:space="preserve">. </w:t>
+      </w:r>
+      <w:r>
+        <w:t>Explain the logic of scaling your data using MinMaxScaler. Why must we store the scaler object to inverse transform the results later?</w:t>
+      </w:r>
+      <w:bookmarkEnd w:id="10"/>
+    </w:p>
+    <w:p>
+      <w:pPr>
+        <w:rPr>
+          <w:sz w:val="24"/>
+          <w:szCs w:val="24"/>
+        </w:rPr>
+      </w:pPr>
+    </w:p>
+    <w:p>
+      <w:pPr>
+        <w:rPr>
+          <w:sz w:val="24"/>
+          <w:szCs w:val="24"/>
+          <w:lang w:val="vi-VN"/>
+        </w:rPr>
+      </w:pPr>
+      <w:r>
+        <w:rPr>
+          <w:sz w:val="24"/>
+          <w:szCs w:val="24"/>
+        </w:rPr>
+        <w:t xml:space="preserve">Why scale: Deep learning models train more stably when input features are on similar numeric ranges. OHLC values and Volume can be on very different scales (Volume can be thousands/millions while prices are ~10–200). MinMaxScaler maps </w:t>
+      </w:r>
+      <w:r>
+        <w:rPr>
+          <w:sz w:val="24"/>
+          <w:szCs w:val="24"/>
+        </w:rPr>
+        <w:t>feature</w:t>
+      </w:r>
+      <w:r>
+        <w:rPr>
+          <w:sz w:val="24"/>
+          <w:szCs w:val="24"/>
+        </w:rPr>
+        <w:t xml:space="preserve"> to [0,1], which:</w:t>
+      </w:r>
+    </w:p>
+    <w:p>
+      <w:pPr>
+        <w:pStyle w:val="ListParagraph"/>
+        <w:numPr>
+          <w:ilvl w:val="0"/>
+          <w:numId w:val="58"/>
+        </w:numPr>
+        <w:rPr>
+          <w:sz w:val="24"/>
+          <w:szCs w:val="24"/>
+        </w:rPr>
+      </w:pPr>
+      <w:r>
+        <w:rPr>
+          <w:sz w:val="24"/>
+          <w:szCs w:val="24"/>
+        </w:rPr>
+        <w:t>stabilizes gradients,</w:t>
+      </w:r>
+    </w:p>
+    <w:p>
+      <w:pPr>
+        <w:pStyle w:val="ListParagraph"/>
+        <w:numPr>
+          <w:ilvl w:val="0"/>
+          <w:numId w:val="58"/>
+        </w:numPr>
+        <w:rPr>
+          <w:sz w:val="24"/>
+          <w:szCs w:val="24"/>
+        </w:rPr>
+      </w:pPr>
+      <w:r>
+        <w:rPr>
+          <w:sz w:val="24"/>
+          <w:szCs w:val="24"/>
+        </w:rPr>
+        <w:t>reduces dominance of large-scale features (like Volume),</w:t>
+      </w:r>
+    </w:p>
+    <w:p>
+      <w:pPr>
+        <w:pStyle w:val="ListParagraph"/>
+        <w:numPr>
+          <w:ilvl w:val="0"/>
+          <w:numId w:val="58"/>
+        </w:numPr>
+        <w:rPr>
+          <w:sz w:val="24"/>
+          <w:szCs w:val="24"/>
+          <w:lang w:val="vi-VN"/>
+        </w:rPr>
+      </w:pPr>
+      <w:r>
+        <w:rPr>
+          <w:sz w:val="24"/>
+          <w:szCs w:val="24"/>
+        </w:rPr>
+        <w:t>often improves convergence speed.</w:t>
+      </w:r>
+    </w:p>
+    <w:p>
+      <w:pPr>
+        <w:rPr>
+          <w:sz w:val="24"/>
+          <w:szCs w:val="24"/>
+          <w:lang w:val="vi-VN"/>
+        </w:rPr>
+      </w:pPr>
+      <w:r>
+        <w:rPr>
+          <w:sz w:val="24"/>
+          <w:szCs w:val="24"/>
+        </w:rPr>
+        <w:t>Why store scaler objects: The model predicts in scaled space, but we must report results in real price units. Therefore, we must save the scaler so we can apply:</w:t>
+      </w:r>
+    </w:p>
+    <w:p>
+      <w:pPr>
+        <w:pStyle w:val="ListParagraph"/>
+        <w:numPr>
+          <w:ilvl w:val="0"/>
+          <w:numId w:val="57"/>
+        </w:numPr>
+        <w:rPr>
+          <w:sz w:val="24"/>
+          <w:szCs w:val="24"/>
+          <w:lang w:val="vi-VN"/>
+        </w:rPr>
+      </w:pPr>
+      <w:r>
+        <w:rPr>
+          <w:sz w:val="24"/>
+          <w:szCs w:val="24"/>
+        </w:rPr>
+        <w:t>inverse_transform(pred_scaled) → real price predictions.</w:t>
+      </w:r>
+    </w:p>
+    <w:p>
+      <w:pPr>
+        <w:rPr>
+          <w:sz w:val="24"/>
+          <w:szCs w:val="24"/>
+        </w:rPr>
+      </w:pPr>
+      <w:r>
+        <w:rPr>
+          <w:sz w:val="24"/>
+          <w:szCs w:val="24"/>
+        </w:rPr>
+        <w:t>My notebook output shows “Scaler keys …”, confirming the scaler is stored and accessible for later inverse-transform and reproducibility</w:t>
+      </w:r>
+      <w:r>
+        <w:rPr>
+          <w:sz w:val="24"/>
+          <w:szCs w:val="24"/>
+        </w:rPr>
+        <w:t>.</w:t>
+      </w:r>
+    </w:p>
+    <w:p>
+      <w:pPr>
+        <w:pStyle w:val="Heading1"/>
+        <w:rPr>
+          <w:sz w:val="24"/>
+          <w:szCs w:val="24"/>
+        </w:rPr>
+      </w:pPr>
+    </w:p>
     <w:sectPr>
-      <w:footerReference w:type="default" r:id="rId10"/>
+      <w:footerReference w:type="default" r:id="rId16"/>
       <w:pgSz w:w="12240" w:h="15840"/>
       <w:pgMar w:top="1440" w:right="1440" w:bottom="1440" w:left="1440" w:header="720" w:footer="720" w:gutter="0"/>
       <w:cols w:space="720"/>
@@ -2065,6 +4533,119 @@
     </w:lvl>
   </w:abstractNum>
   <w:abstractNum w:abstractNumId="5" w15:restartNumberingAfterBreak="0">
+    <w:nsid w:val="0F32328E"/>
+    <w:multiLevelType w:val="hybridMultilevel"/>
+    <w:tmpl w:val="428C7AC4"/>
+    <w:lvl w:ilvl="0" w:tplc="04090001">
+      <w:start w:val="1"/>
+      <w:numFmt w:val="bullet"/>
+      <w:lvlText w:val=""/>
+      <w:lvlJc w:val="left"/>
+      <w:pPr>
+        <w:ind w:left="1440" w:hanging="360"/>
+      </w:pPr>
+      <w:rPr>
+        <w:rFonts w:ascii="Symbol" w:hAnsi="Symbol" w:hint="default"/>
+      </w:rPr>
+    </w:lvl>
+    <w:lvl w:ilvl="1" w:tplc="04090003" w:tentative="1">
+      <w:start w:val="1"/>
+      <w:numFmt w:val="bullet"/>
+      <w:lvlText w:val="o"/>
+      <w:lvlJc w:val="left"/>
+      <w:pPr>
+        <w:ind w:left="2160" w:hanging="360"/>
+      </w:pPr>
+      <w:rPr>
+        <w:rFonts w:ascii="Courier New" w:hAnsi="Courier New" w:cs="Courier New" w:hint="default"/>
+      </w:rPr>
+    </w:lvl>
+    <w:lvl w:ilvl="2" w:tplc="04090005" w:tentative="1">
+      <w:start w:val="1"/>
+      <w:numFmt w:val="bullet"/>
+      <w:lvlText w:val=""/>
+      <w:lvlJc w:val="left"/>
+      <w:pPr>
+        <w:ind w:left="2880" w:hanging="360"/>
+      </w:pPr>
+      <w:rPr>
+        <w:rFonts w:ascii="Wingdings" w:hAnsi="Wingdings" w:hint="default"/>
+      </w:rPr>
+    </w:lvl>
+    <w:lvl w:ilvl="3" w:tplc="04090001" w:tentative="1">
+      <w:start w:val="1"/>
+      <w:numFmt w:val="bullet"/>
+      <w:lvlText w:val=""/>
+      <w:lvlJc w:val="left"/>
+      <w:pPr>
+        <w:ind w:left="3600" w:hanging="360"/>
+      </w:pPr>
+      <w:rPr>
+        <w:rFonts w:ascii="Symbol" w:hAnsi="Symbol" w:hint="default"/>
+      </w:rPr>
+    </w:lvl>
+    <w:lvl w:ilvl="4" w:tplc="04090003" w:tentative="1">
+      <w:start w:val="1"/>
+      <w:numFmt w:val="bullet"/>
+      <w:lvlText w:val="o"/>
+      <w:lvlJc w:val="left"/>
+      <w:pPr>
+        <w:ind w:left="4320" w:hanging="360"/>
+      </w:pPr>
+      <w:rPr>
+        <w:rFonts w:ascii="Courier New" w:hAnsi="Courier New" w:cs="Courier New" w:hint="default"/>
+      </w:rPr>
+    </w:lvl>
+    <w:lvl w:ilvl="5" w:tplc="04090005" w:tentative="1">
+      <w:start w:val="1"/>
+      <w:numFmt w:val="bullet"/>
+      <w:lvlText w:val=""/>
+      <w:lvlJc w:val="left"/>
+      <w:pPr>
+        <w:ind w:left="5040" w:hanging="360"/>
+      </w:pPr>
+      <w:rPr>
+        <w:rFonts w:ascii="Wingdings" w:hAnsi="Wingdings" w:hint="default"/>
+      </w:rPr>
+    </w:lvl>
+    <w:lvl w:ilvl="6" w:tplc="04090001" w:tentative="1">
+      <w:start w:val="1"/>
+      <w:numFmt w:val="bullet"/>
+      <w:lvlText w:val=""/>
+      <w:lvlJc w:val="left"/>
+      <w:pPr>
+        <w:ind w:left="5760" w:hanging="360"/>
+      </w:pPr>
+      <w:rPr>
+        <w:rFonts w:ascii="Symbol" w:hAnsi="Symbol" w:hint="default"/>
+      </w:rPr>
+    </w:lvl>
+    <w:lvl w:ilvl="7" w:tplc="04090003" w:tentative="1">
+      <w:start w:val="1"/>
+      <w:numFmt w:val="bullet"/>
+      <w:lvlText w:val="o"/>
+      <w:lvlJc w:val="left"/>
+      <w:pPr>
+        <w:ind w:left="6480" w:hanging="360"/>
+      </w:pPr>
+      <w:rPr>
+        <w:rFonts w:ascii="Courier New" w:hAnsi="Courier New" w:cs="Courier New" w:hint="default"/>
+      </w:rPr>
+    </w:lvl>
+    <w:lvl w:ilvl="8" w:tplc="04090005" w:tentative="1">
+      <w:start w:val="1"/>
+      <w:numFmt w:val="bullet"/>
+      <w:lvlText w:val=""/>
+      <w:lvlJc w:val="left"/>
+      <w:pPr>
+        <w:ind w:left="7200" w:hanging="360"/>
+      </w:pPr>
+      <w:rPr>
+        <w:rFonts w:ascii="Wingdings" w:hAnsi="Wingdings" w:hint="default"/>
+      </w:rPr>
+    </w:lvl>
+  </w:abstractNum>
+  <w:abstractNum w:abstractNumId="6" w15:restartNumberingAfterBreak="0">
     <w:nsid w:val="101B03BC"/>
     <w:multiLevelType w:val="multilevel"/>
     <w:tmpl w:val="08BA38E4"/>
@@ -2177,7 +4758,7 @@
       </w:pPr>
     </w:lvl>
   </w:abstractNum>
-  <w:abstractNum w:abstractNumId="6" w15:restartNumberingAfterBreak="0">
+  <w:abstractNum w:abstractNumId="7" w15:restartNumberingAfterBreak="0">
     <w:nsid w:val="16F7301B"/>
     <w:multiLevelType w:val="multilevel"/>
     <w:tmpl w:val="6CD0C95C"/>
@@ -2326,7 +4907,7 @@
       </w:rPr>
     </w:lvl>
   </w:abstractNum>
-  <w:abstractNum w:abstractNumId="7" w15:restartNumberingAfterBreak="0">
+  <w:abstractNum w:abstractNumId="8" w15:restartNumberingAfterBreak="0">
     <w:nsid w:val="1AAD069E"/>
     <w:multiLevelType w:val="multilevel"/>
     <w:tmpl w:val="3938A9FA"/>
@@ -2475,7 +5056,7 @@
       </w:rPr>
     </w:lvl>
   </w:abstractNum>
-  <w:abstractNum w:abstractNumId="8" w15:restartNumberingAfterBreak="0">
+  <w:abstractNum w:abstractNumId="9" w15:restartNumberingAfterBreak="0">
     <w:nsid w:val="1EEF5D24"/>
     <w:multiLevelType w:val="multilevel"/>
     <w:tmpl w:val="F27AFC4E"/>
@@ -2588,7 +5169,93 @@
       </w:pPr>
     </w:lvl>
   </w:abstractNum>
-  <w:abstractNum w:abstractNumId="9" w15:restartNumberingAfterBreak="0">
+  <w:abstractNum w:abstractNumId="10" w15:restartNumberingAfterBreak="0">
+    <w:nsid w:val="20650588"/>
+    <w:multiLevelType w:val="hybridMultilevel"/>
+    <w:tmpl w:val="D60C1094"/>
+    <w:lvl w:ilvl="0" w:tplc="0409000F">
+      <w:start w:val="1"/>
+      <w:numFmt w:val="decimal"/>
+      <w:lvlText w:val="%1."/>
+      <w:lvlJc w:val="left"/>
+      <w:pPr>
+        <w:ind w:left="720" w:hanging="360"/>
+      </w:pPr>
+    </w:lvl>
+    <w:lvl w:ilvl="1" w:tplc="04090019" w:tentative="1">
+      <w:start w:val="1"/>
+      <w:numFmt w:val="lowerLetter"/>
+      <w:lvlText w:val="%2."/>
+      <w:lvlJc w:val="left"/>
+      <w:pPr>
+        <w:ind w:left="1440" w:hanging="360"/>
+      </w:pPr>
+    </w:lvl>
+    <w:lvl w:ilvl="2" w:tplc="0409001B" w:tentative="1">
+      <w:start w:val="1"/>
+      <w:numFmt w:val="lowerRoman"/>
+      <w:lvlText w:val="%3."/>
+      <w:lvlJc w:val="right"/>
+      <w:pPr>
+        <w:ind w:left="2160" w:hanging="180"/>
+      </w:pPr>
+    </w:lvl>
+    <w:lvl w:ilvl="3" w:tplc="0409000F" w:tentative="1">
+      <w:start w:val="1"/>
+      <w:numFmt w:val="decimal"/>
+      <w:lvlText w:val="%4."/>
+      <w:lvlJc w:val="left"/>
+      <w:pPr>
+        <w:ind w:left="2880" w:hanging="360"/>
+      </w:pPr>
+    </w:lvl>
+    <w:lvl w:ilvl="4" w:tplc="04090019" w:tentative="1">
+      <w:start w:val="1"/>
+      <w:numFmt w:val="lowerLetter"/>
+      <w:lvlText w:val="%5."/>
+      <w:lvlJc w:val="left"/>
+      <w:pPr>
+        <w:ind w:left="3600" w:hanging="360"/>
+      </w:pPr>
+    </w:lvl>
+    <w:lvl w:ilvl="5" w:tplc="0409001B" w:tentative="1">
+      <w:start w:val="1"/>
+      <w:numFmt w:val="lowerRoman"/>
+      <w:lvlText w:val="%6."/>
+      <w:lvlJc w:val="right"/>
+      <w:pPr>
+        <w:ind w:left="4320" w:hanging="180"/>
+      </w:pPr>
+    </w:lvl>
+    <w:lvl w:ilvl="6" w:tplc="0409000F" w:tentative="1">
+      <w:start w:val="1"/>
+      <w:numFmt w:val="decimal"/>
+      <w:lvlText w:val="%7."/>
+      <w:lvlJc w:val="left"/>
+      <w:pPr>
+        <w:ind w:left="5040" w:hanging="360"/>
+      </w:pPr>
+    </w:lvl>
+    <w:lvl w:ilvl="7" w:tplc="04090019" w:tentative="1">
+      <w:start w:val="1"/>
+      <w:numFmt w:val="lowerLetter"/>
+      <w:lvlText w:val="%8."/>
+      <w:lvlJc w:val="left"/>
+      <w:pPr>
+        <w:ind w:left="5760" w:hanging="360"/>
+      </w:pPr>
+    </w:lvl>
+    <w:lvl w:ilvl="8" w:tplc="0409001B" w:tentative="1">
+      <w:start w:val="1"/>
+      <w:numFmt w:val="lowerRoman"/>
+      <w:lvlText w:val="%9."/>
+      <w:lvlJc w:val="right"/>
+      <w:pPr>
+        <w:ind w:left="6480" w:hanging="180"/>
+      </w:pPr>
+    </w:lvl>
+  </w:abstractNum>
+  <w:abstractNum w:abstractNumId="11" w15:restartNumberingAfterBreak="0">
     <w:nsid w:val="219E74B2"/>
     <w:multiLevelType w:val="hybridMultilevel"/>
     <w:tmpl w:val="90221624"/>
@@ -2677,7 +5344,7 @@
       </w:pPr>
     </w:lvl>
   </w:abstractNum>
-  <w:abstractNum w:abstractNumId="10" w15:restartNumberingAfterBreak="0">
+  <w:abstractNum w:abstractNumId="12" w15:restartNumberingAfterBreak="0">
     <w:nsid w:val="22CF14E2"/>
     <w:multiLevelType w:val="hybridMultilevel"/>
     <w:tmpl w:val="B6DC9000"/>
@@ -2766,7 +5433,7 @@
       </w:pPr>
     </w:lvl>
   </w:abstractNum>
-  <w:abstractNum w:abstractNumId="11" w15:restartNumberingAfterBreak="0">
+  <w:abstractNum w:abstractNumId="13" w15:restartNumberingAfterBreak="0">
     <w:nsid w:val="25C53490"/>
     <w:multiLevelType w:val="multilevel"/>
     <w:tmpl w:val="636C8BC4"/>
@@ -2915,7 +5582,7 @@
       </w:rPr>
     </w:lvl>
   </w:abstractNum>
-  <w:abstractNum w:abstractNumId="12" w15:restartNumberingAfterBreak="0">
+  <w:abstractNum w:abstractNumId="14" w15:restartNumberingAfterBreak="0">
     <w:nsid w:val="27F475D4"/>
     <w:multiLevelType w:val="multilevel"/>
     <w:tmpl w:val="130060FE"/>
@@ -3028,7 +5695,120 @@
       </w:pPr>
     </w:lvl>
   </w:abstractNum>
-  <w:abstractNum w:abstractNumId="13" w15:restartNumberingAfterBreak="0">
+  <w:abstractNum w:abstractNumId="15" w15:restartNumberingAfterBreak="0">
+    <w:nsid w:val="2A345886"/>
+    <w:multiLevelType w:val="hybridMultilevel"/>
+    <w:tmpl w:val="8F30B88C"/>
+    <w:lvl w:ilvl="0" w:tplc="04090001">
+      <w:start w:val="1"/>
+      <w:numFmt w:val="bullet"/>
+      <w:lvlText w:val=""/>
+      <w:lvlJc w:val="left"/>
+      <w:pPr>
+        <w:ind w:left="720" w:hanging="360"/>
+      </w:pPr>
+      <w:rPr>
+        <w:rFonts w:ascii="Symbol" w:hAnsi="Symbol" w:hint="default"/>
+      </w:rPr>
+    </w:lvl>
+    <w:lvl w:ilvl="1" w:tplc="04090003" w:tentative="1">
+      <w:start w:val="1"/>
+      <w:numFmt w:val="bullet"/>
+      <w:lvlText w:val="o"/>
+      <w:lvlJc w:val="left"/>
+      <w:pPr>
+        <w:ind w:left="1440" w:hanging="360"/>
+      </w:pPr>
+      <w:rPr>
+        <w:rFonts w:ascii="Courier New" w:hAnsi="Courier New" w:cs="Courier New" w:hint="default"/>
+      </w:rPr>
+    </w:lvl>
+    <w:lvl w:ilvl="2" w:tplc="04090005" w:tentative="1">
+      <w:start w:val="1"/>
+      <w:numFmt w:val="bullet"/>
+      <w:lvlText w:val=""/>
+      <w:lvlJc w:val="left"/>
+      <w:pPr>
+        <w:ind w:left="2160" w:hanging="360"/>
+      </w:pPr>
+      <w:rPr>
+        <w:rFonts w:ascii="Wingdings" w:hAnsi="Wingdings" w:hint="default"/>
+      </w:rPr>
+    </w:lvl>
+    <w:lvl w:ilvl="3" w:tplc="04090001" w:tentative="1">
+      <w:start w:val="1"/>
+      <w:numFmt w:val="bullet"/>
+      <w:lvlText w:val=""/>
+      <w:lvlJc w:val="left"/>
+      <w:pPr>
+        <w:ind w:left="2880" w:hanging="360"/>
+      </w:pPr>
+      <w:rPr>
+        <w:rFonts w:ascii="Symbol" w:hAnsi="Symbol" w:hint="default"/>
+      </w:rPr>
+    </w:lvl>
+    <w:lvl w:ilvl="4" w:tplc="04090003" w:tentative="1">
+      <w:start w:val="1"/>
+      <w:numFmt w:val="bullet"/>
+      <w:lvlText w:val="o"/>
+      <w:lvlJc w:val="left"/>
+      <w:pPr>
+        <w:ind w:left="3600" w:hanging="360"/>
+      </w:pPr>
+      <w:rPr>
+        <w:rFonts w:ascii="Courier New" w:hAnsi="Courier New" w:cs="Courier New" w:hint="default"/>
+      </w:rPr>
+    </w:lvl>
+    <w:lvl w:ilvl="5" w:tplc="04090005" w:tentative="1">
+      <w:start w:val="1"/>
+      <w:numFmt w:val="bullet"/>
+      <w:lvlText w:val=""/>
+      <w:lvlJc w:val="left"/>
+      <w:pPr>
+        <w:ind w:left="4320" w:hanging="360"/>
+      </w:pPr>
+      <w:rPr>
+        <w:rFonts w:ascii="Wingdings" w:hAnsi="Wingdings" w:hint="default"/>
+      </w:rPr>
+    </w:lvl>
+    <w:lvl w:ilvl="6" w:tplc="04090001" w:tentative="1">
+      <w:start w:val="1"/>
+      <w:numFmt w:val="bullet"/>
+      <w:lvlText w:val=""/>
+      <w:lvlJc w:val="left"/>
+      <w:pPr>
+        <w:ind w:left="5040" w:hanging="360"/>
+      </w:pPr>
+      <w:rPr>
+        <w:rFonts w:ascii="Symbol" w:hAnsi="Symbol" w:hint="default"/>
+      </w:rPr>
+    </w:lvl>
+    <w:lvl w:ilvl="7" w:tplc="04090003" w:tentative="1">
+      <w:start w:val="1"/>
+      <w:numFmt w:val="bullet"/>
+      <w:lvlText w:val="o"/>
+      <w:lvlJc w:val="left"/>
+      <w:pPr>
+        <w:ind w:left="5760" w:hanging="360"/>
+      </w:pPr>
+      <w:rPr>
+        <w:rFonts w:ascii="Courier New" w:hAnsi="Courier New" w:cs="Courier New" w:hint="default"/>
+      </w:rPr>
+    </w:lvl>
+    <w:lvl w:ilvl="8" w:tplc="04090005" w:tentative="1">
+      <w:start w:val="1"/>
+      <w:numFmt w:val="bullet"/>
+      <w:lvlText w:val=""/>
+      <w:lvlJc w:val="left"/>
+      <w:pPr>
+        <w:ind w:left="6480" w:hanging="360"/>
+      </w:pPr>
+      <w:rPr>
+        <w:rFonts w:ascii="Wingdings" w:hAnsi="Wingdings" w:hint="default"/>
+      </w:rPr>
+    </w:lvl>
+  </w:abstractNum>
+  <w:abstractNum w:abstractNumId="16" w15:restartNumberingAfterBreak="0">
     <w:nsid w:val="2F115AA3"/>
     <w:multiLevelType w:val="multilevel"/>
     <w:tmpl w:val="CC06B9A8"/>
@@ -3141,7 +5921,7 @@
       </w:pPr>
     </w:lvl>
   </w:abstractNum>
-  <w:abstractNum w:abstractNumId="14" w15:restartNumberingAfterBreak="0">
+  <w:abstractNum w:abstractNumId="17" w15:restartNumberingAfterBreak="0">
     <w:nsid w:val="30A01B02"/>
     <w:multiLevelType w:val="hybridMultilevel"/>
     <w:tmpl w:val="970E7454"/>
@@ -3254,7 +6034,7 @@
       </w:rPr>
     </w:lvl>
   </w:abstractNum>
-  <w:abstractNum w:abstractNumId="15" w15:restartNumberingAfterBreak="0">
+  <w:abstractNum w:abstractNumId="18" w15:restartNumberingAfterBreak="0">
     <w:nsid w:val="311F2A23"/>
     <w:multiLevelType w:val="multilevel"/>
     <w:tmpl w:val="9C6445F4"/>
@@ -3371,7 +6151,7 @@
       </w:pPr>
     </w:lvl>
   </w:abstractNum>
-  <w:abstractNum w:abstractNumId="16" w15:restartNumberingAfterBreak="0">
+  <w:abstractNum w:abstractNumId="19" w15:restartNumberingAfterBreak="0">
     <w:nsid w:val="34270B31"/>
     <w:multiLevelType w:val="multilevel"/>
     <w:tmpl w:val="0E869CC2"/>
@@ -3520,7 +6300,7 @@
       </w:rPr>
     </w:lvl>
   </w:abstractNum>
-  <w:abstractNum w:abstractNumId="17" w15:restartNumberingAfterBreak="0">
+  <w:abstractNum w:abstractNumId="20" w15:restartNumberingAfterBreak="0">
     <w:nsid w:val="3589075A"/>
     <w:multiLevelType w:val="multilevel"/>
     <w:tmpl w:val="69D204A8"/>
@@ -3633,7 +6413,7 @@
       </w:pPr>
     </w:lvl>
   </w:abstractNum>
-  <w:abstractNum w:abstractNumId="18" w15:restartNumberingAfterBreak="0">
+  <w:abstractNum w:abstractNumId="21" w15:restartNumberingAfterBreak="0">
     <w:nsid w:val="36646853"/>
     <w:multiLevelType w:val="multilevel"/>
     <w:tmpl w:val="0CF69F68"/>
@@ -3746,7 +6526,7 @@
       </w:pPr>
     </w:lvl>
   </w:abstractNum>
-  <w:abstractNum w:abstractNumId="19" w15:restartNumberingAfterBreak="0">
+  <w:abstractNum w:abstractNumId="22" w15:restartNumberingAfterBreak="0">
     <w:nsid w:val="36774258"/>
     <w:multiLevelType w:val="multilevel"/>
     <w:tmpl w:val="BEDA5928"/>
@@ -3859,7 +6639,120 @@
       </w:pPr>
     </w:lvl>
   </w:abstractNum>
-  <w:abstractNum w:abstractNumId="20" w15:restartNumberingAfterBreak="0">
+  <w:abstractNum w:abstractNumId="23" w15:restartNumberingAfterBreak="0">
+    <w:nsid w:val="37E4694E"/>
+    <w:multiLevelType w:val="hybridMultilevel"/>
+    <w:tmpl w:val="EEC6C6E4"/>
+    <w:lvl w:ilvl="0" w:tplc="04090001">
+      <w:start w:val="1"/>
+      <w:numFmt w:val="bullet"/>
+      <w:lvlText w:val=""/>
+      <w:lvlJc w:val="left"/>
+      <w:pPr>
+        <w:ind w:left="720" w:hanging="360"/>
+      </w:pPr>
+      <w:rPr>
+        <w:rFonts w:ascii="Symbol" w:hAnsi="Symbol" w:hint="default"/>
+      </w:rPr>
+    </w:lvl>
+    <w:lvl w:ilvl="1" w:tplc="04090003">
+      <w:start w:val="1"/>
+      <w:numFmt w:val="bullet"/>
+      <w:lvlText w:val="o"/>
+      <w:lvlJc w:val="left"/>
+      <w:pPr>
+        <w:ind w:left="1440" w:hanging="360"/>
+      </w:pPr>
+      <w:rPr>
+        <w:rFonts w:ascii="Courier New" w:hAnsi="Courier New" w:cs="Courier New" w:hint="default"/>
+      </w:rPr>
+    </w:lvl>
+    <w:lvl w:ilvl="2" w:tplc="04090005" w:tentative="1">
+      <w:start w:val="1"/>
+      <w:numFmt w:val="bullet"/>
+      <w:lvlText w:val=""/>
+      <w:lvlJc w:val="left"/>
+      <w:pPr>
+        <w:ind w:left="2160" w:hanging="360"/>
+      </w:pPr>
+      <w:rPr>
+        <w:rFonts w:ascii="Wingdings" w:hAnsi="Wingdings" w:hint="default"/>
+      </w:rPr>
+    </w:lvl>
+    <w:lvl w:ilvl="3" w:tplc="04090001" w:tentative="1">
+      <w:start w:val="1"/>
+      <w:numFmt w:val="bullet"/>
+      <w:lvlText w:val=""/>
+      <w:lvlJc w:val="left"/>
+      <w:pPr>
+        <w:ind w:left="2880" w:hanging="360"/>
+      </w:pPr>
+      <w:rPr>
+        <w:rFonts w:ascii="Symbol" w:hAnsi="Symbol" w:hint="default"/>
+      </w:rPr>
+    </w:lvl>
+    <w:lvl w:ilvl="4" w:tplc="04090003" w:tentative="1">
+      <w:start w:val="1"/>
+      <w:numFmt w:val="bullet"/>
+      <w:lvlText w:val="o"/>
+      <w:lvlJc w:val="left"/>
+      <w:pPr>
+        <w:ind w:left="3600" w:hanging="360"/>
+      </w:pPr>
+      <w:rPr>
+        <w:rFonts w:ascii="Courier New" w:hAnsi="Courier New" w:cs="Courier New" w:hint="default"/>
+      </w:rPr>
+    </w:lvl>
+    <w:lvl w:ilvl="5" w:tplc="04090005" w:tentative="1">
+      <w:start w:val="1"/>
+      <w:numFmt w:val="bullet"/>
+      <w:lvlText w:val=""/>
+      <w:lvlJc w:val="left"/>
+      <w:pPr>
+        <w:ind w:left="4320" w:hanging="360"/>
+      </w:pPr>
+      <w:rPr>
+        <w:rFonts w:ascii="Wingdings" w:hAnsi="Wingdings" w:hint="default"/>
+      </w:rPr>
+    </w:lvl>
+    <w:lvl w:ilvl="6" w:tplc="04090001" w:tentative="1">
+      <w:start w:val="1"/>
+      <w:numFmt w:val="bullet"/>
+      <w:lvlText w:val=""/>
+      <w:lvlJc w:val="left"/>
+      <w:pPr>
+        <w:ind w:left="5040" w:hanging="360"/>
+      </w:pPr>
+      <w:rPr>
+        <w:rFonts w:ascii="Symbol" w:hAnsi="Symbol" w:hint="default"/>
+      </w:rPr>
+    </w:lvl>
+    <w:lvl w:ilvl="7" w:tplc="04090003" w:tentative="1">
+      <w:start w:val="1"/>
+      <w:numFmt w:val="bullet"/>
+      <w:lvlText w:val="o"/>
+      <w:lvlJc w:val="left"/>
+      <w:pPr>
+        <w:ind w:left="5760" w:hanging="360"/>
+      </w:pPr>
+      <w:rPr>
+        <w:rFonts w:ascii="Courier New" w:hAnsi="Courier New" w:cs="Courier New" w:hint="default"/>
+      </w:rPr>
+    </w:lvl>
+    <w:lvl w:ilvl="8" w:tplc="04090005" w:tentative="1">
+      <w:start w:val="1"/>
+      <w:numFmt w:val="bullet"/>
+      <w:lvlText w:val=""/>
+      <w:lvlJc w:val="left"/>
+      <w:pPr>
+        <w:ind w:left="6480" w:hanging="360"/>
+      </w:pPr>
+      <w:rPr>
+        <w:rFonts w:ascii="Wingdings" w:hAnsi="Wingdings" w:hint="default"/>
+      </w:rPr>
+    </w:lvl>
+  </w:abstractNum>
+  <w:abstractNum w:abstractNumId="24" w15:restartNumberingAfterBreak="0">
     <w:nsid w:val="3D291848"/>
     <w:multiLevelType w:val="multilevel"/>
     <w:tmpl w:val="8C644A74"/>
@@ -4008,7 +6901,7 @@
       </w:rPr>
     </w:lvl>
   </w:abstractNum>
-  <w:abstractNum w:abstractNumId="21" w15:restartNumberingAfterBreak="0">
+  <w:abstractNum w:abstractNumId="25" w15:restartNumberingAfterBreak="0">
     <w:nsid w:val="40617883"/>
     <w:multiLevelType w:val="multilevel"/>
     <w:tmpl w:val="08D8BE92"/>
@@ -4157,7 +7050,7 @@
       </w:rPr>
     </w:lvl>
   </w:abstractNum>
-  <w:abstractNum w:abstractNumId="22" w15:restartNumberingAfterBreak="0">
+  <w:abstractNum w:abstractNumId="26" w15:restartNumberingAfterBreak="0">
     <w:nsid w:val="40B23BBC"/>
     <w:multiLevelType w:val="multilevel"/>
     <w:tmpl w:val="BB9E3C94"/>
@@ -4306,7 +7199,7 @@
       </w:rPr>
     </w:lvl>
   </w:abstractNum>
-  <w:abstractNum w:abstractNumId="23" w15:restartNumberingAfterBreak="0">
+  <w:abstractNum w:abstractNumId="27" w15:restartNumberingAfterBreak="0">
     <w:nsid w:val="40B52DC5"/>
     <w:multiLevelType w:val="multilevel"/>
     <w:tmpl w:val="4856989A"/>
@@ -4455,7 +7348,7 @@
       </w:rPr>
     </w:lvl>
   </w:abstractNum>
-  <w:abstractNum w:abstractNumId="24" w15:restartNumberingAfterBreak="0">
+  <w:abstractNum w:abstractNumId="28" w15:restartNumberingAfterBreak="0">
     <w:nsid w:val="42655D11"/>
     <w:multiLevelType w:val="hybridMultilevel"/>
     <w:tmpl w:val="45728910"/>
@@ -4667,7 +7560,7 @@
       </w:rPr>
     </w:lvl>
   </w:abstractNum>
-  <w:abstractNum w:abstractNumId="25" w15:restartNumberingAfterBreak="0">
+  <w:abstractNum w:abstractNumId="29" w15:restartNumberingAfterBreak="0">
     <w:nsid w:val="4271247B"/>
     <w:multiLevelType w:val="multilevel"/>
     <w:tmpl w:val="803CF08E"/>
@@ -4780,7 +7673,156 @@
       </w:pPr>
     </w:lvl>
   </w:abstractNum>
-  <w:abstractNum w:abstractNumId="26" w15:restartNumberingAfterBreak="0">
+  <w:abstractNum w:abstractNumId="30" w15:restartNumberingAfterBreak="0">
+    <w:nsid w:val="435312B1"/>
+    <w:multiLevelType w:val="multilevel"/>
+    <w:tmpl w:val="9E2A455E"/>
+    <w:lvl w:ilvl="0">
+      <w:start w:val="1"/>
+      <w:numFmt w:val="bullet"/>
+      <w:lvlText w:val=""/>
+      <w:lvlJc w:val="left"/>
+      <w:pPr>
+        <w:tabs>
+          <w:tab w:val="num" w:pos="720"/>
+        </w:tabs>
+        <w:ind w:left="720" w:hanging="360"/>
+      </w:pPr>
+      <w:rPr>
+        <w:rFonts w:ascii="Symbol" w:hAnsi="Symbol" w:hint="default"/>
+        <w:sz w:val="20"/>
+      </w:rPr>
+    </w:lvl>
+    <w:lvl w:ilvl="1" w:tentative="1">
+      <w:start w:val="1"/>
+      <w:numFmt w:val="bullet"/>
+      <w:lvlText w:val="o"/>
+      <w:lvlJc w:val="left"/>
+      <w:pPr>
+        <w:tabs>
+          <w:tab w:val="num" w:pos="1440"/>
+        </w:tabs>
+        <w:ind w:left="1440" w:hanging="360"/>
+      </w:pPr>
+      <w:rPr>
+        <w:rFonts w:ascii="Courier New" w:hAnsi="Courier New" w:hint="default"/>
+        <w:sz w:val="20"/>
+      </w:rPr>
+    </w:lvl>
+    <w:lvl w:ilvl="2" w:tentative="1">
+      <w:start w:val="1"/>
+      <w:numFmt w:val="bullet"/>
+      <w:lvlText w:val=""/>
+      <w:lvlJc w:val="left"/>
+      <w:pPr>
+        <w:tabs>
+          <w:tab w:val="num" w:pos="2160"/>
+        </w:tabs>
+        <w:ind w:left="2160" w:hanging="360"/>
+      </w:pPr>
+      <w:rPr>
+        <w:rFonts w:ascii="Wingdings" w:hAnsi="Wingdings" w:hint="default"/>
+        <w:sz w:val="20"/>
+      </w:rPr>
+    </w:lvl>
+    <w:lvl w:ilvl="3" w:tentative="1">
+      <w:start w:val="1"/>
+      <w:numFmt w:val="bullet"/>
+      <w:lvlText w:val=""/>
+      <w:lvlJc w:val="left"/>
+      <w:pPr>
+        <w:tabs>
+          <w:tab w:val="num" w:pos="2880"/>
+        </w:tabs>
+        <w:ind w:left="2880" w:hanging="360"/>
+      </w:pPr>
+      <w:rPr>
+        <w:rFonts w:ascii="Wingdings" w:hAnsi="Wingdings" w:hint="default"/>
+        <w:sz w:val="20"/>
+      </w:rPr>
+    </w:lvl>
+    <w:lvl w:ilvl="4" w:tentative="1">
+      <w:start w:val="1"/>
+      <w:numFmt w:val="bullet"/>
+      <w:lvlText w:val=""/>
+      <w:lvlJc w:val="left"/>
+      <w:pPr>
+        <w:tabs>
+          <w:tab w:val="num" w:pos="3600"/>
+        </w:tabs>
+        <w:ind w:left="3600" w:hanging="360"/>
+      </w:pPr>
+      <w:rPr>
+        <w:rFonts w:ascii="Wingdings" w:hAnsi="Wingdings" w:hint="default"/>
+        <w:sz w:val="20"/>
+      </w:rPr>
+    </w:lvl>
+    <w:lvl w:ilvl="5" w:tentative="1">
+      <w:start w:val="1"/>
+      <w:numFmt w:val="bullet"/>
+      <w:lvlText w:val=""/>
+      <w:lvlJc w:val="left"/>
+      <w:pPr>
+        <w:tabs>
+          <w:tab w:val="num" w:pos="4320"/>
+        </w:tabs>
+        <w:ind w:left="4320" w:hanging="360"/>
+      </w:pPr>
+      <w:rPr>
+        <w:rFonts w:ascii="Wingdings" w:hAnsi="Wingdings" w:hint="default"/>
+        <w:sz w:val="20"/>
+      </w:rPr>
+    </w:lvl>
+    <w:lvl w:ilvl="6" w:tentative="1">
+      <w:start w:val="1"/>
+      <w:numFmt w:val="bullet"/>
+      <w:lvlText w:val=""/>
+      <w:lvlJc w:val="left"/>
+      <w:pPr>
+        <w:tabs>
+          <w:tab w:val="num" w:pos="5040"/>
+        </w:tabs>
+        <w:ind w:left="5040" w:hanging="360"/>
+      </w:pPr>
+      <w:rPr>
+        <w:rFonts w:ascii="Wingdings" w:hAnsi="Wingdings" w:hint="default"/>
+        <w:sz w:val="20"/>
+      </w:rPr>
+    </w:lvl>
+    <w:lvl w:ilvl="7" w:tentative="1">
+      <w:start w:val="1"/>
+      <w:numFmt w:val="bullet"/>
+      <w:lvlText w:val=""/>
+      <w:lvlJc w:val="left"/>
+      <w:pPr>
+        <w:tabs>
+          <w:tab w:val="num" w:pos="5760"/>
+        </w:tabs>
+        <w:ind w:left="5760" w:hanging="360"/>
+      </w:pPr>
+      <w:rPr>
+        <w:rFonts w:ascii="Wingdings" w:hAnsi="Wingdings" w:hint="default"/>
+        <w:sz w:val="20"/>
+      </w:rPr>
+    </w:lvl>
+    <w:lvl w:ilvl="8" w:tentative="1">
+      <w:start w:val="1"/>
+      <w:numFmt w:val="bullet"/>
+      <w:lvlText w:val=""/>
+      <w:lvlJc w:val="left"/>
+      <w:pPr>
+        <w:tabs>
+          <w:tab w:val="num" w:pos="6480"/>
+        </w:tabs>
+        <w:ind w:left="6480" w:hanging="360"/>
+      </w:pPr>
+      <w:rPr>
+        <w:rFonts w:ascii="Wingdings" w:hAnsi="Wingdings" w:hint="default"/>
+        <w:sz w:val="20"/>
+      </w:rPr>
+    </w:lvl>
+  </w:abstractNum>
+  <w:abstractNum w:abstractNumId="31" w15:restartNumberingAfterBreak="0">
     <w:nsid w:val="47361B19"/>
     <w:multiLevelType w:val="multilevel"/>
     <w:tmpl w:val="A112D436"/>
@@ -4893,7 +7935,7 @@
       </w:pPr>
     </w:lvl>
   </w:abstractNum>
-  <w:abstractNum w:abstractNumId="27" w15:restartNumberingAfterBreak="0">
+  <w:abstractNum w:abstractNumId="32" w15:restartNumberingAfterBreak="0">
     <w:nsid w:val="482624A2"/>
     <w:multiLevelType w:val="hybridMultilevel"/>
     <w:tmpl w:val="03D41F72"/>
@@ -5006,7 +8048,7 @@
       </w:rPr>
     </w:lvl>
   </w:abstractNum>
-  <w:abstractNum w:abstractNumId="28" w15:restartNumberingAfterBreak="0">
+  <w:abstractNum w:abstractNumId="33" w15:restartNumberingAfterBreak="0">
     <w:nsid w:val="48EB248D"/>
     <w:multiLevelType w:val="multilevel"/>
     <w:tmpl w:val="ECE848F4"/>
@@ -5155,7 +8197,7 @@
       </w:rPr>
     </w:lvl>
   </w:abstractNum>
-  <w:abstractNum w:abstractNumId="29" w15:restartNumberingAfterBreak="0">
+  <w:abstractNum w:abstractNumId="34" w15:restartNumberingAfterBreak="0">
     <w:nsid w:val="49D10ECB"/>
     <w:multiLevelType w:val="multilevel"/>
     <w:tmpl w:val="57BEA1BE"/>
@@ -5304,7 +8346,7 @@
       </w:rPr>
     </w:lvl>
   </w:abstractNum>
-  <w:abstractNum w:abstractNumId="30" w15:restartNumberingAfterBreak="0">
+  <w:abstractNum w:abstractNumId="35" w15:restartNumberingAfterBreak="0">
     <w:nsid w:val="4B5B398D"/>
     <w:multiLevelType w:val="multilevel"/>
     <w:tmpl w:val="3EBC457E"/>
@@ -5417,7 +8459,7 @@
       </w:pPr>
     </w:lvl>
   </w:abstractNum>
-  <w:abstractNum w:abstractNumId="31" w15:restartNumberingAfterBreak="0">
+  <w:abstractNum w:abstractNumId="36" w15:restartNumberingAfterBreak="0">
     <w:nsid w:val="4CE95A2D"/>
     <w:multiLevelType w:val="hybridMultilevel"/>
     <w:tmpl w:val="7E6EEA62"/>
@@ -5530,7 +8572,7 @@
       </w:rPr>
     </w:lvl>
   </w:abstractNum>
-  <w:abstractNum w:abstractNumId="32" w15:restartNumberingAfterBreak="0">
+  <w:abstractNum w:abstractNumId="37" w15:restartNumberingAfterBreak="0">
     <w:nsid w:val="4E862DC6"/>
     <w:multiLevelType w:val="multilevel"/>
     <w:tmpl w:val="5E6A9E7C"/>
@@ -5643,7 +8685,7 @@
       </w:pPr>
     </w:lvl>
   </w:abstractNum>
-  <w:abstractNum w:abstractNumId="33" w15:restartNumberingAfterBreak="0">
+  <w:abstractNum w:abstractNumId="38" w15:restartNumberingAfterBreak="0">
     <w:nsid w:val="543F3F1B"/>
     <w:multiLevelType w:val="multilevel"/>
     <w:tmpl w:val="3F2846FC"/>
@@ -5756,7 +8798,7 @@
       </w:pPr>
     </w:lvl>
   </w:abstractNum>
-  <w:abstractNum w:abstractNumId="34" w15:restartNumberingAfterBreak="0">
+  <w:abstractNum w:abstractNumId="39" w15:restartNumberingAfterBreak="0">
     <w:nsid w:val="54773059"/>
     <w:multiLevelType w:val="multilevel"/>
     <w:tmpl w:val="EF787604"/>
@@ -5905,7 +8947,7 @@
       </w:rPr>
     </w:lvl>
   </w:abstractNum>
-  <w:abstractNum w:abstractNumId="35" w15:restartNumberingAfterBreak="0">
+  <w:abstractNum w:abstractNumId="40" w15:restartNumberingAfterBreak="0">
     <w:nsid w:val="55375A74"/>
     <w:multiLevelType w:val="multilevel"/>
     <w:tmpl w:val="DE04C0C6"/>
@@ -6018,7 +9060,7 @@
       </w:pPr>
     </w:lvl>
   </w:abstractNum>
-  <w:abstractNum w:abstractNumId="36" w15:restartNumberingAfterBreak="0">
+  <w:abstractNum w:abstractNumId="41" w15:restartNumberingAfterBreak="0">
     <w:nsid w:val="56AB1C69"/>
     <w:multiLevelType w:val="multilevel"/>
     <w:tmpl w:val="5912715C"/>
@@ -6131,7 +9173,7 @@
       </w:pPr>
     </w:lvl>
   </w:abstractNum>
-  <w:abstractNum w:abstractNumId="37" w15:restartNumberingAfterBreak="0">
+  <w:abstractNum w:abstractNumId="42" w15:restartNumberingAfterBreak="0">
     <w:nsid w:val="57470BA5"/>
     <w:multiLevelType w:val="multilevel"/>
     <w:tmpl w:val="BDEA358E"/>
@@ -6244,7 +9286,7 @@
       </w:pPr>
     </w:lvl>
   </w:abstractNum>
-  <w:abstractNum w:abstractNumId="38" w15:restartNumberingAfterBreak="0">
+  <w:abstractNum w:abstractNumId="43" w15:restartNumberingAfterBreak="0">
     <w:nsid w:val="5C980409"/>
     <w:multiLevelType w:val="hybridMultilevel"/>
     <w:tmpl w:val="07DE40E4"/>
@@ -6357,7 +9399,7 @@
       </w:rPr>
     </w:lvl>
   </w:abstractNum>
-  <w:abstractNum w:abstractNumId="39" w15:restartNumberingAfterBreak="0">
+  <w:abstractNum w:abstractNumId="44" w15:restartNumberingAfterBreak="0">
     <w:nsid w:val="5F01615A"/>
     <w:multiLevelType w:val="multilevel"/>
     <w:tmpl w:val="1C74DF5A"/>
@@ -6470,7 +9512,7 @@
       </w:pPr>
     </w:lvl>
   </w:abstractNum>
-  <w:abstractNum w:abstractNumId="40" w15:restartNumberingAfterBreak="0">
+  <w:abstractNum w:abstractNumId="45" w15:restartNumberingAfterBreak="0">
     <w:nsid w:val="5F0F0E87"/>
     <w:multiLevelType w:val="multilevel"/>
     <w:tmpl w:val="0D8C0750"/>
@@ -6619,7 +9661,7 @@
       </w:rPr>
     </w:lvl>
   </w:abstractNum>
-  <w:abstractNum w:abstractNumId="41" w15:restartNumberingAfterBreak="0">
+  <w:abstractNum w:abstractNumId="46" w15:restartNumberingAfterBreak="0">
     <w:nsid w:val="62A1124A"/>
     <w:multiLevelType w:val="hybridMultilevel"/>
     <w:tmpl w:val="AC5E01FE"/>
@@ -6705,7 +9747,7 @@
       </w:pPr>
     </w:lvl>
   </w:abstractNum>
-  <w:abstractNum w:abstractNumId="42" w15:restartNumberingAfterBreak="0">
+  <w:abstractNum w:abstractNumId="47" w15:restartNumberingAfterBreak="0">
     <w:nsid w:val="63033CE3"/>
     <w:multiLevelType w:val="multilevel"/>
     <w:tmpl w:val="2E748540"/>
@@ -6818,7 +9860,7 @@
       </w:pPr>
     </w:lvl>
   </w:abstractNum>
-  <w:abstractNum w:abstractNumId="43" w15:restartNumberingAfterBreak="0">
+  <w:abstractNum w:abstractNumId="48" w15:restartNumberingAfterBreak="0">
     <w:nsid w:val="6404479E"/>
     <w:multiLevelType w:val="multilevel"/>
     <w:tmpl w:val="9898AF00"/>
@@ -6967,7 +10009,7 @@
       </w:rPr>
     </w:lvl>
   </w:abstractNum>
-  <w:abstractNum w:abstractNumId="44" w15:restartNumberingAfterBreak="0">
+  <w:abstractNum w:abstractNumId="49" w15:restartNumberingAfterBreak="0">
     <w:nsid w:val="6B9C7C3A"/>
     <w:multiLevelType w:val="multilevel"/>
     <w:tmpl w:val="261A2130"/>
@@ -7080,7 +10122,7 @@
       </w:pPr>
     </w:lvl>
   </w:abstractNum>
-  <w:abstractNum w:abstractNumId="45" w15:restartNumberingAfterBreak="0">
+  <w:abstractNum w:abstractNumId="50" w15:restartNumberingAfterBreak="0">
     <w:nsid w:val="6BBA1AB0"/>
     <w:multiLevelType w:val="multilevel"/>
     <w:tmpl w:val="EB4C5452"/>
@@ -7193,7 +10235,7 @@
       </w:pPr>
     </w:lvl>
   </w:abstractNum>
-  <w:abstractNum w:abstractNumId="46" w15:restartNumberingAfterBreak="0">
+  <w:abstractNum w:abstractNumId="51" w15:restartNumberingAfterBreak="0">
     <w:nsid w:val="6CA12EE8"/>
     <w:multiLevelType w:val="multilevel"/>
     <w:tmpl w:val="79AA1454"/>
@@ -7342,7 +10384,233 @@
       </w:rPr>
     </w:lvl>
   </w:abstractNum>
-  <w:abstractNum w:abstractNumId="47" w15:restartNumberingAfterBreak="0">
+  <w:abstractNum w:abstractNumId="52" w15:restartNumberingAfterBreak="0">
+    <w:nsid w:val="6D953586"/>
+    <w:multiLevelType w:val="hybridMultilevel"/>
+    <w:tmpl w:val="13BC7002"/>
+    <w:lvl w:ilvl="0" w:tplc="04090001">
+      <w:start w:val="1"/>
+      <w:numFmt w:val="bullet"/>
+      <w:lvlText w:val=""/>
+      <w:lvlJc w:val="left"/>
+      <w:pPr>
+        <w:ind w:left="720" w:hanging="360"/>
+      </w:pPr>
+      <w:rPr>
+        <w:rFonts w:ascii="Symbol" w:hAnsi="Symbol" w:hint="default"/>
+      </w:rPr>
+    </w:lvl>
+    <w:lvl w:ilvl="1" w:tplc="04090003" w:tentative="1">
+      <w:start w:val="1"/>
+      <w:numFmt w:val="bullet"/>
+      <w:lvlText w:val="o"/>
+      <w:lvlJc w:val="left"/>
+      <w:pPr>
+        <w:ind w:left="1440" w:hanging="360"/>
+      </w:pPr>
+      <w:rPr>
+        <w:rFonts w:ascii="Courier New" w:hAnsi="Courier New" w:cs="Courier New" w:hint="default"/>
+      </w:rPr>
+    </w:lvl>
+    <w:lvl w:ilvl="2" w:tplc="04090005" w:tentative="1">
+      <w:start w:val="1"/>
+      <w:numFmt w:val="bullet"/>
+      <w:lvlText w:val=""/>
+      <w:lvlJc w:val="left"/>
+      <w:pPr>
+        <w:ind w:left="2160" w:hanging="360"/>
+      </w:pPr>
+      <w:rPr>
+        <w:rFonts w:ascii="Wingdings" w:hAnsi="Wingdings" w:hint="default"/>
+      </w:rPr>
+    </w:lvl>
+    <w:lvl w:ilvl="3" w:tplc="04090001" w:tentative="1">
+      <w:start w:val="1"/>
+      <w:numFmt w:val="bullet"/>
+      <w:lvlText w:val=""/>
+      <w:lvlJc w:val="left"/>
+      <w:pPr>
+        <w:ind w:left="2880" w:hanging="360"/>
+      </w:pPr>
+      <w:rPr>
+        <w:rFonts w:ascii="Symbol" w:hAnsi="Symbol" w:hint="default"/>
+      </w:rPr>
+    </w:lvl>
+    <w:lvl w:ilvl="4" w:tplc="04090003" w:tentative="1">
+      <w:start w:val="1"/>
+      <w:numFmt w:val="bullet"/>
+      <w:lvlText w:val="o"/>
+      <w:lvlJc w:val="left"/>
+      <w:pPr>
+        <w:ind w:left="3600" w:hanging="360"/>
+      </w:pPr>
+      <w:rPr>
+        <w:rFonts w:ascii="Courier New" w:hAnsi="Courier New" w:cs="Courier New" w:hint="default"/>
+      </w:rPr>
+    </w:lvl>
+    <w:lvl w:ilvl="5" w:tplc="04090005" w:tentative="1">
+      <w:start w:val="1"/>
+      <w:numFmt w:val="bullet"/>
+      <w:lvlText w:val=""/>
+      <w:lvlJc w:val="left"/>
+      <w:pPr>
+        <w:ind w:left="4320" w:hanging="360"/>
+      </w:pPr>
+      <w:rPr>
+        <w:rFonts w:ascii="Wingdings" w:hAnsi="Wingdings" w:hint="default"/>
+      </w:rPr>
+    </w:lvl>
+    <w:lvl w:ilvl="6" w:tplc="04090001" w:tentative="1">
+      <w:start w:val="1"/>
+      <w:numFmt w:val="bullet"/>
+      <w:lvlText w:val=""/>
+      <w:lvlJc w:val="left"/>
+      <w:pPr>
+        <w:ind w:left="5040" w:hanging="360"/>
+      </w:pPr>
+      <w:rPr>
+        <w:rFonts w:ascii="Symbol" w:hAnsi="Symbol" w:hint="default"/>
+      </w:rPr>
+    </w:lvl>
+    <w:lvl w:ilvl="7" w:tplc="04090003" w:tentative="1">
+      <w:start w:val="1"/>
+      <w:numFmt w:val="bullet"/>
+      <w:lvlText w:val="o"/>
+      <w:lvlJc w:val="left"/>
+      <w:pPr>
+        <w:ind w:left="5760" w:hanging="360"/>
+      </w:pPr>
+      <w:rPr>
+        <w:rFonts w:ascii="Courier New" w:hAnsi="Courier New" w:cs="Courier New" w:hint="default"/>
+      </w:rPr>
+    </w:lvl>
+    <w:lvl w:ilvl="8" w:tplc="04090005" w:tentative="1">
+      <w:start w:val="1"/>
+      <w:numFmt w:val="bullet"/>
+      <w:lvlText w:val=""/>
+      <w:lvlJc w:val="left"/>
+      <w:pPr>
+        <w:ind w:left="6480" w:hanging="360"/>
+      </w:pPr>
+      <w:rPr>
+        <w:rFonts w:ascii="Wingdings" w:hAnsi="Wingdings" w:hint="default"/>
+      </w:rPr>
+    </w:lvl>
+  </w:abstractNum>
+  <w:abstractNum w:abstractNumId="53" w15:restartNumberingAfterBreak="0">
+    <w:nsid w:val="6F4207EF"/>
+    <w:multiLevelType w:val="hybridMultilevel"/>
+    <w:tmpl w:val="25989462"/>
+    <w:lvl w:ilvl="0" w:tplc="04090001">
+      <w:start w:val="1"/>
+      <w:numFmt w:val="bullet"/>
+      <w:lvlText w:val=""/>
+      <w:lvlJc w:val="left"/>
+      <w:pPr>
+        <w:ind w:left="720" w:hanging="360"/>
+      </w:pPr>
+      <w:rPr>
+        <w:rFonts w:ascii="Symbol" w:hAnsi="Symbol" w:hint="default"/>
+      </w:rPr>
+    </w:lvl>
+    <w:lvl w:ilvl="1" w:tplc="04090003" w:tentative="1">
+      <w:start w:val="1"/>
+      <w:numFmt w:val="bullet"/>
+      <w:lvlText w:val="o"/>
+      <w:lvlJc w:val="left"/>
+      <w:pPr>
+        <w:ind w:left="1440" w:hanging="360"/>
+      </w:pPr>
+      <w:rPr>
+        <w:rFonts w:ascii="Courier New" w:hAnsi="Courier New" w:cs="Courier New" w:hint="default"/>
+      </w:rPr>
+    </w:lvl>
+    <w:lvl w:ilvl="2" w:tplc="04090005" w:tentative="1">
+      <w:start w:val="1"/>
+      <w:numFmt w:val="bullet"/>
+      <w:lvlText w:val=""/>
+      <w:lvlJc w:val="left"/>
+      <w:pPr>
+        <w:ind w:left="2160" w:hanging="360"/>
+      </w:pPr>
+      <w:rPr>
+        <w:rFonts w:ascii="Wingdings" w:hAnsi="Wingdings" w:hint="default"/>
+      </w:rPr>
+    </w:lvl>
+    <w:lvl w:ilvl="3" w:tplc="04090001" w:tentative="1">
+      <w:start w:val="1"/>
+      <w:numFmt w:val="bullet"/>
+      <w:lvlText w:val=""/>
+      <w:lvlJc w:val="left"/>
+      <w:pPr>
+        <w:ind w:left="2880" w:hanging="360"/>
+      </w:pPr>
+      <w:rPr>
+        <w:rFonts w:ascii="Symbol" w:hAnsi="Symbol" w:hint="default"/>
+      </w:rPr>
+    </w:lvl>
+    <w:lvl w:ilvl="4" w:tplc="04090003" w:tentative="1">
+      <w:start w:val="1"/>
+      <w:numFmt w:val="bullet"/>
+      <w:lvlText w:val="o"/>
+      <w:lvlJc w:val="left"/>
+      <w:pPr>
+        <w:ind w:left="3600" w:hanging="360"/>
+      </w:pPr>
+      <w:rPr>
+        <w:rFonts w:ascii="Courier New" w:hAnsi="Courier New" w:cs="Courier New" w:hint="default"/>
+      </w:rPr>
+    </w:lvl>
+    <w:lvl w:ilvl="5" w:tplc="04090005" w:tentative="1">
+      <w:start w:val="1"/>
+      <w:numFmt w:val="bullet"/>
+      <w:lvlText w:val=""/>
+      <w:lvlJc w:val="left"/>
+      <w:pPr>
+        <w:ind w:left="4320" w:hanging="360"/>
+      </w:pPr>
+      <w:rPr>
+        <w:rFonts w:ascii="Wingdings" w:hAnsi="Wingdings" w:hint="default"/>
+      </w:rPr>
+    </w:lvl>
+    <w:lvl w:ilvl="6" w:tplc="04090001" w:tentative="1">
+      <w:start w:val="1"/>
+      <w:numFmt w:val="bullet"/>
+      <w:lvlText w:val=""/>
+      <w:lvlJc w:val="left"/>
+      <w:pPr>
+        <w:ind w:left="5040" w:hanging="360"/>
+      </w:pPr>
+      <w:rPr>
+        <w:rFonts w:ascii="Symbol" w:hAnsi="Symbol" w:hint="default"/>
+      </w:rPr>
+    </w:lvl>
+    <w:lvl w:ilvl="7" w:tplc="04090003" w:tentative="1">
+      <w:start w:val="1"/>
+      <w:numFmt w:val="bullet"/>
+      <w:lvlText w:val="o"/>
+      <w:lvlJc w:val="left"/>
+      <w:pPr>
+        <w:ind w:left="5760" w:hanging="360"/>
+      </w:pPr>
+      <w:rPr>
+        <w:rFonts w:ascii="Courier New" w:hAnsi="Courier New" w:cs="Courier New" w:hint="default"/>
+      </w:rPr>
+    </w:lvl>
+    <w:lvl w:ilvl="8" w:tplc="04090005" w:tentative="1">
+      <w:start w:val="1"/>
+      <w:numFmt w:val="bullet"/>
+      <w:lvlText w:val=""/>
+      <w:lvlJc w:val="left"/>
+      <w:pPr>
+        <w:ind w:left="6480" w:hanging="360"/>
+      </w:pPr>
+      <w:rPr>
+        <w:rFonts w:ascii="Wingdings" w:hAnsi="Wingdings" w:hint="default"/>
+      </w:rPr>
+    </w:lvl>
+  </w:abstractNum>
+  <w:abstractNum w:abstractNumId="54" w15:restartNumberingAfterBreak="0">
     <w:nsid w:val="748557FD"/>
     <w:multiLevelType w:val="multilevel"/>
     <w:tmpl w:val="7D000AD4"/>
@@ -7459,7 +10727,120 @@
       </w:pPr>
     </w:lvl>
   </w:abstractNum>
-  <w:abstractNum w:abstractNumId="48" w15:restartNumberingAfterBreak="0">
+  <w:abstractNum w:abstractNumId="55" w15:restartNumberingAfterBreak="0">
+    <w:nsid w:val="7514602C"/>
+    <w:multiLevelType w:val="hybridMultilevel"/>
+    <w:tmpl w:val="7FA6A138"/>
+    <w:lvl w:ilvl="0" w:tplc="04090001">
+      <w:start w:val="1"/>
+      <w:numFmt w:val="bullet"/>
+      <w:lvlText w:val=""/>
+      <w:lvlJc w:val="left"/>
+      <w:pPr>
+        <w:ind w:left="720" w:hanging="360"/>
+      </w:pPr>
+      <w:rPr>
+        <w:rFonts w:ascii="Symbol" w:hAnsi="Symbol" w:hint="default"/>
+      </w:rPr>
+    </w:lvl>
+    <w:lvl w:ilvl="1" w:tplc="04090003" w:tentative="1">
+      <w:start w:val="1"/>
+      <w:numFmt w:val="bullet"/>
+      <w:lvlText w:val="o"/>
+      <w:lvlJc w:val="left"/>
+      <w:pPr>
+        <w:ind w:left="1440" w:hanging="360"/>
+      </w:pPr>
+      <w:rPr>
+        <w:rFonts w:ascii="Courier New" w:hAnsi="Courier New" w:cs="Courier New" w:hint="default"/>
+      </w:rPr>
+    </w:lvl>
+    <w:lvl w:ilvl="2" w:tplc="04090005" w:tentative="1">
+      <w:start w:val="1"/>
+      <w:numFmt w:val="bullet"/>
+      <w:lvlText w:val=""/>
+      <w:lvlJc w:val="left"/>
+      <w:pPr>
+        <w:ind w:left="2160" w:hanging="360"/>
+      </w:pPr>
+      <w:rPr>
+        <w:rFonts w:ascii="Wingdings" w:hAnsi="Wingdings" w:hint="default"/>
+      </w:rPr>
+    </w:lvl>
+    <w:lvl w:ilvl="3" w:tplc="04090001" w:tentative="1">
+      <w:start w:val="1"/>
+      <w:numFmt w:val="bullet"/>
+      <w:lvlText w:val=""/>
+      <w:lvlJc w:val="left"/>
+      <w:pPr>
+        <w:ind w:left="2880" w:hanging="360"/>
+      </w:pPr>
+      <w:rPr>
+        <w:rFonts w:ascii="Symbol" w:hAnsi="Symbol" w:hint="default"/>
+      </w:rPr>
+    </w:lvl>
+    <w:lvl w:ilvl="4" w:tplc="04090003" w:tentative="1">
+      <w:start w:val="1"/>
+      <w:numFmt w:val="bullet"/>
+      <w:lvlText w:val="o"/>
+      <w:lvlJc w:val="left"/>
+      <w:pPr>
+        <w:ind w:left="3600" w:hanging="360"/>
+      </w:pPr>
+      <w:rPr>
+        <w:rFonts w:ascii="Courier New" w:hAnsi="Courier New" w:cs="Courier New" w:hint="default"/>
+      </w:rPr>
+    </w:lvl>
+    <w:lvl w:ilvl="5" w:tplc="04090005" w:tentative="1">
+      <w:start w:val="1"/>
+      <w:numFmt w:val="bullet"/>
+      <w:lvlText w:val=""/>
+      <w:lvlJc w:val="left"/>
+      <w:pPr>
+        <w:ind w:left="4320" w:hanging="360"/>
+      </w:pPr>
+      <w:rPr>
+        <w:rFonts w:ascii="Wingdings" w:hAnsi="Wingdings" w:hint="default"/>
+      </w:rPr>
+    </w:lvl>
+    <w:lvl w:ilvl="6" w:tplc="04090001" w:tentative="1">
+      <w:start w:val="1"/>
+      <w:numFmt w:val="bullet"/>
+      <w:lvlText w:val=""/>
+      <w:lvlJc w:val="left"/>
+      <w:pPr>
+        <w:ind w:left="5040" w:hanging="360"/>
+      </w:pPr>
+      <w:rPr>
+        <w:rFonts w:ascii="Symbol" w:hAnsi="Symbol" w:hint="default"/>
+      </w:rPr>
+    </w:lvl>
+    <w:lvl w:ilvl="7" w:tplc="04090003" w:tentative="1">
+      <w:start w:val="1"/>
+      <w:numFmt w:val="bullet"/>
+      <w:lvlText w:val="o"/>
+      <w:lvlJc w:val="left"/>
+      <w:pPr>
+        <w:ind w:left="5760" w:hanging="360"/>
+      </w:pPr>
+      <w:rPr>
+        <w:rFonts w:ascii="Courier New" w:hAnsi="Courier New" w:cs="Courier New" w:hint="default"/>
+      </w:rPr>
+    </w:lvl>
+    <w:lvl w:ilvl="8" w:tplc="04090005" w:tentative="1">
+      <w:start w:val="1"/>
+      <w:numFmt w:val="bullet"/>
+      <w:lvlText w:val=""/>
+      <w:lvlJc w:val="left"/>
+      <w:pPr>
+        <w:ind w:left="6480" w:hanging="360"/>
+      </w:pPr>
+      <w:rPr>
+        <w:rFonts w:ascii="Wingdings" w:hAnsi="Wingdings" w:hint="default"/>
+      </w:rPr>
+    </w:lvl>
+  </w:abstractNum>
+  <w:abstractNum w:abstractNumId="56" w15:restartNumberingAfterBreak="0">
     <w:nsid w:val="7DDF2BBA"/>
     <w:multiLevelType w:val="multilevel"/>
     <w:tmpl w:val="8244F758"/>
@@ -7608,152 +10989,292 @@
       </w:rPr>
     </w:lvl>
   </w:abstractNum>
+  <w:abstractNum w:abstractNumId="57" w15:restartNumberingAfterBreak="0">
+    <w:nsid w:val="7EF670E5"/>
+    <w:multiLevelType w:val="hybridMultilevel"/>
+    <w:tmpl w:val="7F488002"/>
+    <w:lvl w:ilvl="0" w:tplc="04090001">
+      <w:start w:val="1"/>
+      <w:numFmt w:val="bullet"/>
+      <w:lvlText w:val=""/>
+      <w:lvlJc w:val="left"/>
+      <w:pPr>
+        <w:ind w:left="720" w:hanging="360"/>
+      </w:pPr>
+      <w:rPr>
+        <w:rFonts w:ascii="Symbol" w:hAnsi="Symbol" w:hint="default"/>
+      </w:rPr>
+    </w:lvl>
+    <w:lvl w:ilvl="1" w:tplc="04090003" w:tentative="1">
+      <w:start w:val="1"/>
+      <w:numFmt w:val="bullet"/>
+      <w:lvlText w:val="o"/>
+      <w:lvlJc w:val="left"/>
+      <w:pPr>
+        <w:ind w:left="1440" w:hanging="360"/>
+      </w:pPr>
+      <w:rPr>
+        <w:rFonts w:ascii="Courier New" w:hAnsi="Courier New" w:cs="Courier New" w:hint="default"/>
+      </w:rPr>
+    </w:lvl>
+    <w:lvl w:ilvl="2" w:tplc="04090005" w:tentative="1">
+      <w:start w:val="1"/>
+      <w:numFmt w:val="bullet"/>
+      <w:lvlText w:val=""/>
+      <w:lvlJc w:val="left"/>
+      <w:pPr>
+        <w:ind w:left="2160" w:hanging="360"/>
+      </w:pPr>
+      <w:rPr>
+        <w:rFonts w:ascii="Wingdings" w:hAnsi="Wingdings" w:hint="default"/>
+      </w:rPr>
+    </w:lvl>
+    <w:lvl w:ilvl="3" w:tplc="04090001" w:tentative="1">
+      <w:start w:val="1"/>
+      <w:numFmt w:val="bullet"/>
+      <w:lvlText w:val=""/>
+      <w:lvlJc w:val="left"/>
+      <w:pPr>
+        <w:ind w:left="2880" w:hanging="360"/>
+      </w:pPr>
+      <w:rPr>
+        <w:rFonts w:ascii="Symbol" w:hAnsi="Symbol" w:hint="default"/>
+      </w:rPr>
+    </w:lvl>
+    <w:lvl w:ilvl="4" w:tplc="04090003" w:tentative="1">
+      <w:start w:val="1"/>
+      <w:numFmt w:val="bullet"/>
+      <w:lvlText w:val="o"/>
+      <w:lvlJc w:val="left"/>
+      <w:pPr>
+        <w:ind w:left="3600" w:hanging="360"/>
+      </w:pPr>
+      <w:rPr>
+        <w:rFonts w:ascii="Courier New" w:hAnsi="Courier New" w:cs="Courier New" w:hint="default"/>
+      </w:rPr>
+    </w:lvl>
+    <w:lvl w:ilvl="5" w:tplc="04090005" w:tentative="1">
+      <w:start w:val="1"/>
+      <w:numFmt w:val="bullet"/>
+      <w:lvlText w:val=""/>
+      <w:lvlJc w:val="left"/>
+      <w:pPr>
+        <w:ind w:left="4320" w:hanging="360"/>
+      </w:pPr>
+      <w:rPr>
+        <w:rFonts w:ascii="Wingdings" w:hAnsi="Wingdings" w:hint="default"/>
+      </w:rPr>
+    </w:lvl>
+    <w:lvl w:ilvl="6" w:tplc="04090001" w:tentative="1">
+      <w:start w:val="1"/>
+      <w:numFmt w:val="bullet"/>
+      <w:lvlText w:val=""/>
+      <w:lvlJc w:val="left"/>
+      <w:pPr>
+        <w:ind w:left="5040" w:hanging="360"/>
+      </w:pPr>
+      <w:rPr>
+        <w:rFonts w:ascii="Symbol" w:hAnsi="Symbol" w:hint="default"/>
+      </w:rPr>
+    </w:lvl>
+    <w:lvl w:ilvl="7" w:tplc="04090003" w:tentative="1">
+      <w:start w:val="1"/>
+      <w:numFmt w:val="bullet"/>
+      <w:lvlText w:val="o"/>
+      <w:lvlJc w:val="left"/>
+      <w:pPr>
+        <w:ind w:left="5760" w:hanging="360"/>
+      </w:pPr>
+      <w:rPr>
+        <w:rFonts w:ascii="Courier New" w:hAnsi="Courier New" w:cs="Courier New" w:hint="default"/>
+      </w:rPr>
+    </w:lvl>
+    <w:lvl w:ilvl="8" w:tplc="04090005" w:tentative="1">
+      <w:start w:val="1"/>
+      <w:numFmt w:val="bullet"/>
+      <w:lvlText w:val=""/>
+      <w:lvlJc w:val="left"/>
+      <w:pPr>
+        <w:ind w:left="6480" w:hanging="360"/>
+      </w:pPr>
+      <w:rPr>
+        <w:rFonts w:ascii="Wingdings" w:hAnsi="Wingdings" w:hint="default"/>
+      </w:rPr>
+    </w:lvl>
+  </w:abstractNum>
   <w:num w:numId="1" w16cid:durableId="1236935857">
-    <w:abstractNumId w:val="38"/>
+    <w:abstractNumId w:val="43"/>
   </w:num>
   <w:num w:numId="2" w16cid:durableId="435566242">
-    <w:abstractNumId w:val="14"/>
+    <w:abstractNumId w:val="17"/>
   </w:num>
   <w:num w:numId="3" w16cid:durableId="2048795788">
-    <w:abstractNumId w:val="9"/>
+    <w:abstractNumId w:val="11"/>
   </w:num>
   <w:num w:numId="4" w16cid:durableId="19402658">
-    <w:abstractNumId w:val="10"/>
+    <w:abstractNumId w:val="12"/>
   </w:num>
   <w:num w:numId="5" w16cid:durableId="402264125">
-    <w:abstractNumId w:val="43"/>
+    <w:abstractNumId w:val="48"/>
   </w:num>
   <w:num w:numId="6" w16cid:durableId="136797821">
-    <w:abstractNumId w:val="28"/>
+    <w:abstractNumId w:val="33"/>
   </w:num>
   <w:num w:numId="7" w16cid:durableId="1026979914">
-    <w:abstractNumId w:val="22"/>
+    <w:abstractNumId w:val="26"/>
   </w:num>
   <w:num w:numId="8" w16cid:durableId="831414895">
-    <w:abstractNumId w:val="32"/>
+    <w:abstractNumId w:val="37"/>
   </w:num>
   <w:num w:numId="9" w16cid:durableId="1162624610">
-    <w:abstractNumId w:val="44"/>
+    <w:abstractNumId w:val="49"/>
   </w:num>
   <w:num w:numId="10" w16cid:durableId="1354112838">
     <w:abstractNumId w:val="2"/>
   </w:num>
   <w:num w:numId="11" w16cid:durableId="2120098509">
+    <w:abstractNumId w:val="9"/>
+  </w:num>
+  <w:num w:numId="12" w16cid:durableId="421027308">
+    <w:abstractNumId w:val="41"/>
+  </w:num>
+  <w:num w:numId="13" w16cid:durableId="1165822763">
     <w:abstractNumId w:val="8"/>
   </w:num>
-  <w:num w:numId="12" w16cid:durableId="421027308">
-    <w:abstractNumId w:val="36"/>
-  </w:num>
-  <w:num w:numId="13" w16cid:durableId="1165822763">
-    <w:abstractNumId w:val="7"/>
-  </w:num>
   <w:num w:numId="14" w16cid:durableId="1548445103">
-    <w:abstractNumId w:val="47"/>
+    <w:abstractNumId w:val="54"/>
   </w:num>
   <w:num w:numId="15" w16cid:durableId="1200043998">
-    <w:abstractNumId w:val="33"/>
+    <w:abstractNumId w:val="38"/>
   </w:num>
   <w:num w:numId="16" w16cid:durableId="1074013276">
     <w:abstractNumId w:val="3"/>
   </w:num>
   <w:num w:numId="17" w16cid:durableId="57672581">
-    <w:abstractNumId w:val="25"/>
+    <w:abstractNumId w:val="29"/>
   </w:num>
   <w:num w:numId="18" w16cid:durableId="1797017878">
-    <w:abstractNumId w:val="37"/>
+    <w:abstractNumId w:val="42"/>
   </w:num>
   <w:num w:numId="19" w16cid:durableId="263656912">
-    <w:abstractNumId w:val="15"/>
+    <w:abstractNumId w:val="18"/>
   </w:num>
   <w:num w:numId="20" w16cid:durableId="1977106548">
-    <w:abstractNumId w:val="35"/>
+    <w:abstractNumId w:val="40"/>
   </w:num>
   <w:num w:numId="21" w16cid:durableId="689331596">
-    <w:abstractNumId w:val="45"/>
+    <w:abstractNumId w:val="50"/>
   </w:num>
   <w:num w:numId="22" w16cid:durableId="1693411647">
-    <w:abstractNumId w:val="18"/>
+    <w:abstractNumId w:val="21"/>
   </w:num>
   <w:num w:numId="23" w16cid:durableId="861279766">
     <w:abstractNumId w:val="0"/>
   </w:num>
   <w:num w:numId="24" w16cid:durableId="1255477651">
-    <w:abstractNumId w:val="26"/>
+    <w:abstractNumId w:val="31"/>
   </w:num>
   <w:num w:numId="25" w16cid:durableId="89861078">
-    <w:abstractNumId w:val="39"/>
+    <w:abstractNumId w:val="44"/>
   </w:num>
   <w:num w:numId="26" w16cid:durableId="1358628215">
     <w:abstractNumId w:val="1"/>
   </w:num>
   <w:num w:numId="27" w16cid:durableId="2061247251">
-    <w:abstractNumId w:val="23"/>
+    <w:abstractNumId w:val="27"/>
   </w:num>
   <w:num w:numId="28" w16cid:durableId="729497572">
-    <w:abstractNumId w:val="21"/>
+    <w:abstractNumId w:val="25"/>
   </w:num>
   <w:num w:numId="29" w16cid:durableId="1523394011">
-    <w:abstractNumId w:val="19"/>
+    <w:abstractNumId w:val="22"/>
   </w:num>
   <w:num w:numId="30" w16cid:durableId="1386486700">
-    <w:abstractNumId w:val="48"/>
+    <w:abstractNumId w:val="56"/>
   </w:num>
   <w:num w:numId="31" w16cid:durableId="997883729">
+    <w:abstractNumId w:val="7"/>
+  </w:num>
+  <w:num w:numId="32" w16cid:durableId="1939562132">
+    <w:abstractNumId w:val="16"/>
+  </w:num>
+  <w:num w:numId="33" w16cid:durableId="1724525555">
     <w:abstractNumId w:val="6"/>
   </w:num>
-  <w:num w:numId="32" w16cid:durableId="1939562132">
-    <w:abstractNumId w:val="13"/>
-  </w:num>
-  <w:num w:numId="33" w16cid:durableId="1724525555">
-    <w:abstractNumId w:val="5"/>
-  </w:num>
   <w:num w:numId="34" w16cid:durableId="140732897">
-    <w:abstractNumId w:val="17"/>
+    <w:abstractNumId w:val="20"/>
   </w:num>
   <w:num w:numId="35" w16cid:durableId="922758439">
-    <w:abstractNumId w:val="12"/>
+    <w:abstractNumId w:val="14"/>
   </w:num>
   <w:num w:numId="36" w16cid:durableId="680359321">
-    <w:abstractNumId w:val="46"/>
+    <w:abstractNumId w:val="51"/>
   </w:num>
   <w:num w:numId="37" w16cid:durableId="597565012">
     <w:abstractNumId w:val="4"/>
   </w:num>
   <w:num w:numId="38" w16cid:durableId="599605275">
+    <w:abstractNumId w:val="35"/>
+  </w:num>
+  <w:num w:numId="39" w16cid:durableId="1761442480">
+    <w:abstractNumId w:val="24"/>
+  </w:num>
+  <w:num w:numId="40" w16cid:durableId="1030305548">
+    <w:abstractNumId w:val="34"/>
+  </w:num>
+  <w:num w:numId="41" w16cid:durableId="681712695">
+    <w:abstractNumId w:val="19"/>
+  </w:num>
+  <w:num w:numId="42" w16cid:durableId="2096853602">
+    <w:abstractNumId w:val="45"/>
+  </w:num>
+  <w:num w:numId="43" w16cid:durableId="2127310007">
+    <w:abstractNumId w:val="39"/>
+  </w:num>
+  <w:num w:numId="44" w16cid:durableId="1160197808">
+    <w:abstractNumId w:val="13"/>
+  </w:num>
+  <w:num w:numId="45" w16cid:durableId="809829450">
+    <w:abstractNumId w:val="47"/>
+  </w:num>
+  <w:num w:numId="46" w16cid:durableId="1441796612">
+    <w:abstractNumId w:val="36"/>
+  </w:num>
+  <w:num w:numId="47" w16cid:durableId="701632388">
+    <w:abstractNumId w:val="28"/>
+  </w:num>
+  <w:num w:numId="48" w16cid:durableId="905913948">
+    <w:abstractNumId w:val="46"/>
+  </w:num>
+  <w:num w:numId="49" w16cid:durableId="1083406128">
+    <w:abstractNumId w:val="32"/>
+  </w:num>
+  <w:num w:numId="50" w16cid:durableId="149559630">
+    <w:abstractNumId w:val="55"/>
+  </w:num>
+  <w:num w:numId="51" w16cid:durableId="271979548">
+    <w:abstractNumId w:val="23"/>
+  </w:num>
+  <w:num w:numId="52" w16cid:durableId="1067917153">
     <w:abstractNumId w:val="30"/>
   </w:num>
-  <w:num w:numId="39" w16cid:durableId="1761442480">
-    <w:abstractNumId w:val="20"/>
+  <w:num w:numId="53" w16cid:durableId="436366410">
+    <w:abstractNumId w:val="5"/>
   </w:num>
-  <w:num w:numId="40" w16cid:durableId="1030305548">
-    <w:abstractNumId w:val="29"/>
+  <w:num w:numId="54" w16cid:durableId="1303728612">
+    <w:abstractNumId w:val="53"/>
   </w:num>
-  <w:num w:numId="41" w16cid:durableId="681712695">
-    <w:abstractNumId w:val="16"/>
+  <w:num w:numId="55" w16cid:durableId="965740544">
+    <w:abstractNumId w:val="10"/>
   </w:num>
-  <w:num w:numId="42" w16cid:durableId="2096853602">
-    <w:abstractNumId w:val="40"/>
+  <w:num w:numId="56" w16cid:durableId="1684698706">
+    <w:abstractNumId w:val="57"/>
   </w:num>
-  <w:num w:numId="43" w16cid:durableId="2127310007">
-    <w:abstractNumId w:val="34"/>
+  <w:num w:numId="57" w16cid:durableId="1815676039">
+    <w:abstractNumId w:val="52"/>
   </w:num>
-  <w:num w:numId="44" w16cid:durableId="1160197808">
-    <w:abstractNumId w:val="11"/>
-  </w:num>
-  <w:num w:numId="45" w16cid:durableId="809829450">
-    <w:abstractNumId w:val="42"/>
-  </w:num>
-  <w:num w:numId="46" w16cid:durableId="1441796612">
-    <w:abstractNumId w:val="31"/>
-  </w:num>
-  <w:num w:numId="47" w16cid:durableId="701632388">
-    <w:abstractNumId w:val="24"/>
-  </w:num>
-  <w:num w:numId="48" w16cid:durableId="905913948">
-    <w:abstractNumId w:val="41"/>
-  </w:num>
-  <w:num w:numId="49" w16cid:durableId="1083406128">
-    <w:abstractNumId w:val="27"/>
+  <w:num w:numId="58" w16cid:durableId="1287270930">
+    <w:abstractNumId w:val="15"/>
   </w:num>
 </w:numbering>
 </file>
@@ -8229,7 +11750,6 @@
   <w:style w:type="character" w:default="1" w:styleId="DefaultParagraphFont">
     <w:name w:val="Default Paragraph Font"/>
     <w:uiPriority w:val="1"/>
-    <w:semiHidden/>
     <w:unhideWhenUsed/>
   </w:style>
   <w:style w:type="table" w:default="1" w:styleId="TableNormal">
@@ -8548,6 +12068,37 @@
       <w:spacing w:after="100"/>
       <w:ind w:left="440"/>
     </w:pPr>
+  </w:style>
+  <w:style w:type="paragraph" w:styleId="Subtitle">
+    <w:name w:val="Subtitle"/>
+    <w:basedOn w:val="Normal"/>
+    <w:next w:val="Normal"/>
+    <w:link w:val="SubtitleChar"/>
+    <w:uiPriority w:val="11"/>
+    <w:qFormat/>
+    <w:rsid w:val="00071E81"/>
+    <w:pPr>
+      <w:numPr>
+        <w:ilvl w:val="1"/>
+      </w:numPr>
+    </w:pPr>
+    <w:rPr>
+      <w:rFonts w:eastAsiaTheme="minorEastAsia"/>
+      <w:color w:val="5A5A5A" w:themeColor="text1" w:themeTint="A5"/>
+      <w:spacing w:val="15"/>
+    </w:rPr>
+  </w:style>
+  <w:style w:type="character" w:customStyle="1" w:styleId="SubtitleChar">
+    <w:name w:val="Subtitle Char"/>
+    <w:basedOn w:val="DefaultParagraphFont"/>
+    <w:link w:val="Subtitle"/>
+    <w:uiPriority w:val="11"/>
+    <w:rsid w:val="00071E81"/>
+    <w:rPr>
+      <w:rFonts w:eastAsiaTheme="minorEastAsia"/>
+      <w:color w:val="5A5A5A" w:themeColor="text1" w:themeTint="A5"/>
+      <w:spacing w:val="15"/>
+    </w:rPr>
   </w:style>
 </w:styles>
 </file>

</xml_diff>